<commit_message>
write some lecture for type of roadmapping
</commit_message>
<xml_diff>
--- a/final word file/karimi-ownmade-file.docx
+++ b/final word file/karimi-ownmade-file.docx
@@ -42684,7 +42684,6 @@
     <w:p>
       <w:pPr>
         <w:rPr>
-          <w:rtl/>
           <w:lang w:bidi="fa-IR"/>
         </w:rPr>
       </w:pPr>
@@ -43373,11 +43372,353 @@
     <w:p>
       <w:pPr>
         <w:rPr>
+          <w:rtl/>
           <w:lang w:bidi="fa-IR"/>
         </w:rPr>
       </w:pPr>
       <w:r>
         <w:rPr>
+          <w:rFonts w:hint="cs"/>
+          <w:rtl/>
+          <w:lang w:bidi="fa-IR"/>
+        </w:rPr>
+        <w:t>نقشه‌ی راه فناوری خود مدل‌های گوناگونی دارد که در طول زمان تکامل یافته و ایجاد شده‌اند. در ادامه مدل‌های پر استفاده توضیح داده می‌شوند.</w:t>
+      </w:r>
+    </w:p>
+    <w:p>
+      <w:pPr>
+        <w:pStyle w:val="ListParagraph"/>
+        <w:numPr>
+          <w:ilvl w:val="0"/>
+          <w:numId w:val="13"/>
+        </w:numPr>
+        <w:rPr>
+          <w:b/>
+          <w:bCs/>
+          <w:lang w:bidi="fa-IR"/>
+        </w:rPr>
+      </w:pPr>
+      <w:r>
+        <w:rPr>
+          <w:rFonts w:hint="cs"/>
+          <w:b/>
+          <w:bCs/>
+          <w:rtl/>
+          <w:lang w:bidi="fa-IR"/>
+        </w:rPr>
+        <w:t>مدل سه لایه بازار-محصول-فناوری</w:t>
+      </w:r>
+      <w:r>
+        <w:rPr>
+          <w:rStyle w:val="FootnoteReference"/>
+          <w:b/>
+          <w:bCs/>
+          <w:rtl/>
+          <w:lang w:bidi="fa-IR"/>
+        </w:rPr>
+        <w:footnoteReference w:id="36"/>
+      </w:r>
+    </w:p>
+    <w:p>
+      <w:pPr>
+        <w:pStyle w:val="ListParagraph"/>
+        <w:numPr>
+          <w:ilvl w:val="0"/>
+          <w:numId w:val="13"/>
+        </w:numPr>
+        <w:rPr>
+          <w:b/>
+          <w:bCs/>
+          <w:lang w:bidi="fa-IR"/>
+        </w:rPr>
+      </w:pPr>
+      <w:r>
+        <w:rPr>
+          <w:rFonts w:hint="cs"/>
+          <w:b/>
+          <w:bCs/>
+          <w:rtl/>
+          <w:lang w:bidi="fa-IR"/>
+        </w:rPr>
+        <w:t>جعبه ابزار نقشه راه کمبریج</w:t>
+      </w:r>
+      <w:r>
+        <w:rPr>
+          <w:rStyle w:val="FootnoteReference"/>
+          <w:b/>
+          <w:bCs/>
+          <w:rtl/>
+          <w:lang w:bidi="fa-IR"/>
+        </w:rPr>
+        <w:footnoteReference w:id="37"/>
+      </w:r>
+    </w:p>
+    <w:p>
+      <w:pPr>
+        <w:pStyle w:val="ListParagraph"/>
+        <w:numPr>
+          <w:ilvl w:val="0"/>
+          <w:numId w:val="13"/>
+        </w:numPr>
+        <w:rPr>
+          <w:b/>
+          <w:bCs/>
+          <w:lang w:bidi="fa-IR"/>
+        </w:rPr>
+      </w:pPr>
+      <w:r>
+        <w:rPr>
+          <w:rFonts w:hint="cs"/>
+          <w:b/>
+          <w:bCs/>
+          <w:rtl/>
+          <w:lang w:bidi="fa-IR"/>
+        </w:rPr>
+        <w:t>نقشه راه مبتنی بر متا مدل</w:t>
+      </w:r>
+      <w:r>
+        <w:rPr>
+          <w:rStyle w:val="FootnoteReference"/>
+          <w:b/>
+          <w:bCs/>
+          <w:rtl/>
+          <w:lang w:bidi="fa-IR"/>
+        </w:rPr>
+        <w:footnoteReference w:id="38"/>
+      </w:r>
+    </w:p>
+    <w:p>
+      <w:pPr>
+        <w:pStyle w:val="ListParagraph"/>
+        <w:numPr>
+          <w:ilvl w:val="0"/>
+          <w:numId w:val="13"/>
+        </w:numPr>
+        <w:rPr>
+          <w:b/>
+          <w:bCs/>
+          <w:lang w:bidi="fa-IR"/>
+        </w:rPr>
+      </w:pPr>
+      <w:r>
+        <w:rPr>
+          <w:rFonts w:hint="cs"/>
+          <w:b/>
+          <w:bCs/>
+          <w:rtl/>
+          <w:lang w:bidi="fa-IR"/>
+        </w:rPr>
+        <w:t>نقشه راه دیجیتال</w:t>
+      </w:r>
+      <w:r>
+        <w:rPr>
+          <w:rStyle w:val="FootnoteReference"/>
+          <w:b/>
+          <w:bCs/>
+          <w:rtl/>
+          <w:lang w:bidi="fa-IR"/>
+        </w:rPr>
+        <w:footnoteReference w:id="39"/>
+      </w:r>
+    </w:p>
+    <w:p>
+      <w:pPr>
+        <w:pStyle w:val="ListParagraph"/>
+        <w:numPr>
+          <w:ilvl w:val="0"/>
+          <w:numId w:val="13"/>
+        </w:numPr>
+        <w:rPr>
+          <w:b/>
+          <w:bCs/>
+          <w:lang w:bidi="fa-IR"/>
+        </w:rPr>
+      </w:pPr>
+      <w:r>
+        <w:rPr>
+          <w:b/>
+          <w:bCs/>
+          <w:rtl/>
+          <w:lang w:bidi="fa-IR"/>
+        </w:rPr>
+        <w:t>تدو</w:t>
+      </w:r>
+      <w:r>
+        <w:rPr>
+          <w:rFonts w:hint="cs"/>
+          <w:b/>
+          <w:bCs/>
+          <w:rtl/>
+          <w:lang w:bidi="fa-IR"/>
+        </w:rPr>
+        <w:t>ین</w:t>
+      </w:r>
+      <w:r>
+        <w:rPr>
+          <w:b/>
+          <w:bCs/>
+          <w:rtl/>
+          <w:lang w:bidi="fa-IR"/>
+        </w:rPr>
+        <w:t xml:space="preserve"> نقشه راه مبتن</w:t>
+      </w:r>
+      <w:r>
+        <w:rPr>
+          <w:rFonts w:hint="cs"/>
+          <w:b/>
+          <w:bCs/>
+          <w:rtl/>
+          <w:lang w:bidi="fa-IR"/>
+        </w:rPr>
+        <w:t>ی</w:t>
+      </w:r>
+      <w:r>
+        <w:rPr>
+          <w:b/>
+          <w:bCs/>
+          <w:rtl/>
+          <w:lang w:bidi="fa-IR"/>
+        </w:rPr>
+        <w:t xml:space="preserve"> بر سنار</w:t>
+      </w:r>
+      <w:r>
+        <w:rPr>
+          <w:rFonts w:hint="cs"/>
+          <w:b/>
+          <w:bCs/>
+          <w:rtl/>
+          <w:lang w:bidi="fa-IR"/>
+        </w:rPr>
+        <w:t>یو</w:t>
+      </w:r>
+      <w:r>
+        <w:rPr>
+          <w:b/>
+          <w:bCs/>
+          <w:rtl/>
+          <w:lang w:bidi="fa-IR"/>
+        </w:rPr>
+        <w:t xml:space="preserve"> و با پشت</w:t>
+      </w:r>
+      <w:r>
+        <w:rPr>
+          <w:rFonts w:hint="cs"/>
+          <w:b/>
+          <w:bCs/>
+          <w:rtl/>
+          <w:lang w:bidi="fa-IR"/>
+        </w:rPr>
+        <w:t>یبانی</w:t>
+      </w:r>
+      <w:r>
+        <w:rPr>
+          <w:b/>
+          <w:bCs/>
+          <w:rtl/>
+          <w:lang w:bidi="fa-IR"/>
+        </w:rPr>
+        <w:t xml:space="preserve"> هوش مصنوع</w:t>
+      </w:r>
+      <w:r>
+        <w:rPr>
+          <w:rFonts w:hint="cs"/>
+          <w:b/>
+          <w:bCs/>
+          <w:rtl/>
+          <w:lang w:bidi="fa-IR"/>
+        </w:rPr>
+        <w:t>ی</w:t>
+      </w:r>
+      <w:r>
+        <w:rPr>
+          <w:rStyle w:val="FootnoteReference"/>
+          <w:b/>
+          <w:bCs/>
+          <w:rtl/>
+          <w:lang w:bidi="fa-IR"/>
+        </w:rPr>
+        <w:footnoteReference w:id="40"/>
+      </w:r>
+    </w:p>
+    <w:p>
+      <w:pPr>
+        <w:pStyle w:val="ListParagraph"/>
+        <w:numPr>
+          <w:ilvl w:val="0"/>
+          <w:numId w:val="13"/>
+        </w:numPr>
+        <w:rPr>
+          <w:b/>
+          <w:bCs/>
+          <w:lang w:bidi="fa-IR"/>
+        </w:rPr>
+      </w:pPr>
+      <w:r>
+        <w:rPr>
+          <w:rFonts w:hint="cs"/>
+          <w:b/>
+          <w:bCs/>
+          <w:rtl/>
+          <w:lang w:bidi="fa-IR"/>
+        </w:rPr>
+        <w:t>نقشه راه فرایند تصمیم گیری مارکوف و جستجوی درخت مونت کارلو</w:t>
+      </w:r>
+      <w:r>
+        <w:rPr>
+          <w:rStyle w:val="FootnoteReference"/>
+          <w:b/>
+          <w:bCs/>
+          <w:rtl/>
+          <w:lang w:bidi="fa-IR"/>
+        </w:rPr>
+        <w:footnoteReference w:id="41"/>
+      </w:r>
+    </w:p>
+    <w:p>
+      <w:pPr>
+        <w:pStyle w:val="ListParagraph"/>
+        <w:numPr>
+          <w:ilvl w:val="0"/>
+          <w:numId w:val="13"/>
+        </w:numPr>
+        <w:rPr>
+          <w:rFonts w:hint="cs"/>
+          <w:b/>
+          <w:bCs/>
+          <w:rtl/>
+          <w:lang w:bidi="fa-IR"/>
+        </w:rPr>
+      </w:pPr>
+      <w:r>
+        <w:rPr>
+          <w:rFonts w:hint="cs"/>
+          <w:b/>
+          <w:bCs/>
+          <w:rtl/>
+          <w:lang w:bidi="fa-IR"/>
+        </w:rPr>
+        <w:lastRenderedPageBreak/>
+        <w:t>نقشه راه گارتنر : کشش بازار-فشار فناوری- ترکیبی</w:t>
+      </w:r>
+      <w:r>
+        <w:rPr>
+          <w:rStyle w:val="FootnoteReference"/>
+          <w:b/>
+          <w:bCs/>
+          <w:rtl/>
+          <w:lang w:bidi="fa-IR"/>
+        </w:rPr>
+        <w:footnoteReference w:id="42"/>
+      </w:r>
+    </w:p>
+    <w:p>
+      <w:pPr>
+        <w:rPr>
+          <w:lang w:bidi="fa-IR"/>
+        </w:rPr>
+      </w:pPr>
+      <w:r>
+        <w:rPr>
           <w:rtl/>
           <w:lang w:bidi="fa-IR"/>
         </w:rPr>
@@ -43852,6 +44193,13 @@
         </w:rPr>
         <w:t>.</w:t>
       </w:r>
+    </w:p>
+    <w:p>
+      <w:pPr>
+        <w:rPr>
+          <w:lang w:bidi="fa-IR"/>
+        </w:rPr>
+      </w:pPr>
     </w:p>
     <w:p>
       <w:pPr>
@@ -43880,7 +44228,7 @@
           <w:rStyle w:val="FootnoteReference"/>
           <w:rtl/>
         </w:rPr>
-        <w:footnoteReference w:id="36"/>
+        <w:footnoteReference w:id="43"/>
       </w:r>
       <w:bookmarkEnd w:id="23"/>
     </w:p>
@@ -44024,14 +44372,7 @@
         <w:rPr>
           <w:rtl/>
         </w:rPr>
-        <w:t xml:space="preserve">منابع و شایستگی‌ها برای سازگاری با محیط‌های پرتلاطم اشاره دارد. این نظریه بر این نکته تأکید دارد که مزیت رقابتی پایدار تنها با داشتن منابع ارزشمند حاصل نمی‌شود، بلکه سازمان باید توانایی مداوم در بازآرایی و نوآوری مدل‌های کسب‌وکار و دارایی‌های فناورانه خود داشته باشد. در صنایع فناورمحور مانند خودروهای برقی، که تغییرات تکنولوژیک و نیازهای بازار به سرعت رخ می‌دهد، وجود </w:t>
-      </w:r>
-      <w:r>
-        <w:rPr>
-          <w:rtl/>
-        </w:rPr>
-        <w:lastRenderedPageBreak/>
-        <w:t>توانمندی‌های پویا برای بقا و رشد سازمان‌ها حیاتی است و به آن‌ها کمک می‌کند مسیر نوآوری را با تحولات فناورانه هم‌راستا سازند</w:t>
+        <w:t>منابع و شایستگی‌ها برای سازگاری با محیط‌های پرتلاطم اشاره دارد. این نظریه بر این نکته تأکید دارد که مزیت رقابتی پایدار تنها با داشتن منابع ارزشمند حاصل نمی‌شود، بلکه سازمان باید توانایی مداوم در بازآرایی و نوآوری مدل‌های کسب‌وکار و دارایی‌های فناورانه خود داشته باشد. در صنایع فناورمحور مانند خودروهای برقی، که تغییرات تکنولوژیک و نیازهای بازار به سرعت رخ می‌دهد، وجود توانمندی‌های پویا برای بقا و رشد سازمان‌ها حیاتی است و به آن‌ها کمک می‌کند مسیر نوآوری را با تحولات فناورانه هم‌راستا سازند</w:t>
       </w:r>
       <w:r>
         <w:t>.</w:t>
@@ -44062,7 +44403,7 @@
           <w:rStyle w:val="FootnoteReference"/>
           <w:rtl/>
         </w:rPr>
-        <w:footnoteReference w:id="37"/>
+        <w:footnoteReference w:id="44"/>
       </w:r>
       <w:bookmarkEnd w:id="24"/>
     </w:p>
@@ -45164,6 +45505,7 @@
           <w:rFonts w:hint="cs"/>
           <w:rtl/>
         </w:rPr>
+        <w:lastRenderedPageBreak/>
         <w:t>از</w:t>
       </w:r>
       <w:r>
@@ -46070,7 +46412,7 @@
           <w:rStyle w:val="FootnoteReference"/>
           <w:rtl/>
         </w:rPr>
-        <w:footnoteReference w:id="38"/>
+        <w:footnoteReference w:id="45"/>
       </w:r>
       <w:r>
         <w:rPr>
@@ -46129,7 +46471,7 @@
           <w:rStyle w:val="FootnoteReference"/>
           <w:rtl/>
         </w:rPr>
-        <w:footnoteReference w:id="39"/>
+        <w:footnoteReference w:id="46"/>
       </w:r>
       <w:r>
         <w:rPr>
@@ -46253,7 +46595,7 @@
           <w:rStyle w:val="FootnoteReference"/>
           <w:rtl/>
         </w:rPr>
-        <w:footnoteReference w:id="40"/>
+        <w:footnoteReference w:id="47"/>
       </w:r>
       <w:r>
         <w:rPr>
@@ -46464,7 +46806,6 @@
         <w:rPr>
           <w:rtl/>
         </w:rPr>
-        <w:lastRenderedPageBreak/>
         <w:t>ا</w:t>
       </w:r>
       <w:r>
@@ -46668,7 +47009,7 @@
           <w:rStyle w:val="FootnoteReference"/>
           <w:rtl/>
         </w:rPr>
-        <w:footnoteReference w:id="41"/>
+        <w:footnoteReference w:id="48"/>
       </w:r>
       <w:r>
         <w:rPr>
@@ -46688,7 +47029,7 @@
           <w:rStyle w:val="FootnoteReference"/>
           <w:rtl/>
         </w:rPr>
-        <w:footnoteReference w:id="42"/>
+        <w:footnoteReference w:id="49"/>
       </w:r>
       <w:r>
         <w:rPr>
@@ -46708,7 +47049,7 @@
           <w:rStyle w:val="FootnoteReference"/>
           <w:rtl/>
         </w:rPr>
-        <w:footnoteReference w:id="43"/>
+        <w:footnoteReference w:id="50"/>
       </w:r>
       <w:r>
         <w:rPr>
@@ -47866,6 +48207,7 @@
           <w:rFonts w:hint="cs"/>
           <w:rtl/>
         </w:rPr>
+        <w:lastRenderedPageBreak/>
         <w:t>بررسی پیشینه تحقیق</w:t>
       </w:r>
       <w:bookmarkEnd w:id="26"/>
@@ -47984,7 +48326,7 @@
           <w:rtl/>
           <w:lang w:bidi="fa-IR"/>
         </w:rPr>
-        <w:footnoteReference w:id="44"/>
+        <w:footnoteReference w:id="51"/>
       </w:r>
       <w:r>
         <w:rPr>
@@ -48011,7 +48353,7 @@
           <w:rStyle w:val="FootnoteReference"/>
           <w:lang w:bidi="fa-IR"/>
         </w:rPr>
-        <w:footnoteReference w:id="45"/>
+        <w:footnoteReference w:id="52"/>
       </w:r>
       <w:r>
         <w:rPr>
@@ -48027,7 +48369,7 @@
           <w:rtl/>
           <w:lang w:bidi="fa-IR"/>
         </w:rPr>
-        <w:footnoteReference w:id="46"/>
+        <w:footnoteReference w:id="53"/>
       </w:r>
       <w:r>
         <w:rPr>
@@ -48043,7 +48385,7 @@
           <w:rtl/>
           <w:lang w:bidi="fa-IR"/>
         </w:rPr>
-        <w:footnoteReference w:id="47"/>
+        <w:footnoteReference w:id="54"/>
       </w:r>
       <w:r>
         <w:rPr>
@@ -48059,7 +48401,7 @@
           <w:rtl/>
           <w:lang w:bidi="fa-IR"/>
         </w:rPr>
-        <w:footnoteReference w:id="48"/>
+        <w:footnoteReference w:id="55"/>
       </w:r>
       <w:r>
         <w:rPr>
@@ -48080,7 +48422,7 @@
           <w:rStyle w:val="FootnoteReference"/>
           <w:lang w:bidi="fa-IR"/>
         </w:rPr>
-        <w:footnoteReference w:id="49"/>
+        <w:footnoteReference w:id="56"/>
       </w:r>
       <w:r>
         <w:rPr>
@@ -48096,24 +48438,15 @@
           <w:rtl/>
           <w:lang w:bidi="fa-IR"/>
         </w:rPr>
-        <w:footnoteReference w:id="50"/>
-      </w:r>
-      <w:r>
-        <w:rPr>
-          <w:rFonts w:hint="cs"/>
-          <w:rtl/>
-          <w:lang w:bidi="fa-IR"/>
-        </w:rPr>
-        <w:t xml:space="preserve"> است. در ادامه با ایده‌ی چرخه عمر فناوری </w:t>
-      </w:r>
-      <w:r>
-        <w:rPr>
-          <w:rFonts w:hint="cs"/>
-          <w:rtl/>
-          <w:lang w:bidi="fa-IR"/>
-        </w:rPr>
-        <w:lastRenderedPageBreak/>
-        <w:t>نوسان های زمانی را تفسیر نموده‌‌اند، به این معنی که بر اساس فراوانی های پتنت ها در سال های مختلف سعی در تفسیر چرخه ی عمر فناوری داشته‌اند. نتیجه ی این پژوهش نشان می‌دهد که ژاپن در باتری های لیتیوم-یون و الکترولیز قلیایی هیدروژن بسیار فعال است، چین در زیست انرژی پیشتاز بوده و المان با وجود شدت بالای حجم پتنت‌های موجود از این کشور ها عقب تر است. این موضوع نشان میدهد که صرفا شمارش تعداد پتنت‌های ثبت شده معیار کافی نیست و باید شاخص ها در کنار واقعیت های بازار و سیاست گذاری قرار بگیرند. همچنین به گفته‌ی نویسندگان پژوهش پتنت‌ها نمی‌توانند نمایه‌ی کامل نوآوری باشند و از جهت حساسیت به قواعد جستجو و عدم ثبت تمامی اختراعات و پیشبرد ها به عنوان پتنت و همچنین نسبت دهی های جغرافیایی محدودیت هایی نیز در خود دارند. ما در این پژوهش با منطق موجود و اما با داده های به روز تر به کار می‌گیریم و علاوه بر شاخص های کمی، خوشه بندی معنایی متن پتنت ها و تحلیل کلاستر‌های به دست آمده بر اساس فراوانی تجمعی و مشخص نمودن چرخه عمر هر کدام از این کلاستر ها نقشه‌ی راه فناوری در حوزه خودروهای برقی را ترسیم می‌کنیم.</w:t>
+        <w:footnoteReference w:id="57"/>
+      </w:r>
+      <w:r>
+        <w:rPr>
+          <w:rFonts w:hint="cs"/>
+          <w:rtl/>
+          <w:lang w:bidi="fa-IR"/>
+        </w:rPr>
+        <w:t xml:space="preserve"> است. در ادامه با ایده‌ی چرخه عمر فناوری نوسان های زمانی را تفسیر نموده‌‌اند، به این معنی که بر اساس فراوانی های پتنت ها در سال های مختلف سعی در تفسیر چرخه ی عمر فناوری داشته‌اند. نتیجه ی این پژوهش نشان می‌دهد که ژاپن در باتری های لیتیوم-یون و الکترولیز قلیایی هیدروژن بسیار فعال است، چین در زیست انرژی پیشتاز بوده و المان با وجود شدت بالای حجم پتنت‌های موجود از این کشور ها عقب تر است. این موضوع نشان میدهد که صرفا شمارش تعداد پتنت‌های ثبت شده معیار کافی نیست و باید شاخص ها در کنار واقعیت های بازار و سیاست گذاری قرار بگیرند. همچنین به گفته‌ی نویسندگان پژوهش پتنت‌ها نمی‌توانند نمایه‌ی کامل نوآوری باشند و از جهت حساسیت به قواعد جستجو و عدم ثبت تمامی اختراعات و پیشبرد ها به عنوان پتنت و همچنین نسبت دهی های جغرافیایی محدودیت هایی نیز در خود دارند. ما در این پژوهش با منطق موجود و اما با داده های به روز تر به کار می‌گیریم و علاوه بر شاخص های کمی، خوشه بندی معنایی متن پتنت ها و تحلیل کلاستر‌های به دست آمده بر اساس فراوانی تجمعی و مشخص نمودن چرخه عمر هر کدام از این کلاستر ها نقشه‌ی راه فناوری در حوزه خودروهای برقی را ترسیم می‌کنیم.</w:t>
       </w:r>
     </w:p>
     <w:p>
@@ -48129,6 +48462,7 @@
           <w:rtl/>
           <w:lang w:bidi="fa-IR"/>
         </w:rPr>
+        <w:lastRenderedPageBreak/>
         <w:t xml:space="preserve">برای مشخص نمودن مسیر فناوری در ساخت باتری های لیتیومی، ژاو و همکاران </w:t>
       </w:r>
       <w:r>
@@ -48235,7 +48569,7 @@
           <w:rtl/>
           <w:lang w:bidi="fa-IR"/>
         </w:rPr>
-        <w:footnoteReference w:id="51"/>
+        <w:footnoteReference w:id="58"/>
       </w:r>
       <w:r>
         <w:rPr>
@@ -48251,7 +48585,7 @@
           <w:rtl/>
           <w:lang w:bidi="fa-IR"/>
         </w:rPr>
-        <w:footnoteReference w:id="52"/>
+        <w:footnoteReference w:id="59"/>
       </w:r>
       <w:r>
         <w:rPr>
@@ -48267,7 +48601,7 @@
           <w:rtl/>
           <w:lang w:bidi="fa-IR"/>
         </w:rPr>
-        <w:footnoteReference w:id="53"/>
+        <w:footnoteReference w:id="60"/>
       </w:r>
       <w:r>
         <w:rPr>
@@ -48283,7 +48617,7 @@
           <w:rtl/>
           <w:lang w:bidi="fa-IR"/>
         </w:rPr>
-        <w:footnoteReference w:id="54"/>
+        <w:footnoteReference w:id="61"/>
       </w:r>
       <w:r>
         <w:rPr>
@@ -49199,7 +49533,7 @@
           <w:rStyle w:val="FootnoteReference"/>
           <w:lang w:bidi="fa-IR"/>
         </w:rPr>
-        <w:footnoteReference w:id="55"/>
+        <w:footnoteReference w:id="62"/>
       </w:r>
       <w:r>
         <w:rPr>
@@ -49215,24 +49549,15 @@
           <w:rtl/>
           <w:lang w:bidi="fa-IR"/>
         </w:rPr>
-        <w:footnoteReference w:id="56"/>
-      </w:r>
-      <w:r>
-        <w:rPr>
-          <w:rFonts w:hint="cs"/>
-          <w:rtl/>
-          <w:lang w:bidi="fa-IR"/>
-        </w:rPr>
-        <w:t xml:space="preserve"> بر پایه تحلیل معنایی پتنت ها و متون غیر پتنت شروع نمودند. سپس پتنت ها را بر اساس موضوعات خوشه بندی کردند تا زیر حوزه های فناوری را بدست آورند، و در مرحله سوم با مدل سازی روابط </w:t>
-      </w:r>
-      <w:r>
-        <w:rPr>
-          <w:rFonts w:hint="cs"/>
-          <w:rtl/>
-          <w:lang w:bidi="fa-IR"/>
-        </w:rPr>
-        <w:lastRenderedPageBreak/>
-        <w:t>میان خوشه ها توسط شبکه عصبی کانولوشنی گراف</w:t>
+        <w:footnoteReference w:id="63"/>
+      </w:r>
+      <w:r>
+        <w:rPr>
+          <w:rFonts w:hint="cs"/>
+          <w:rtl/>
+          <w:lang w:bidi="fa-IR"/>
+        </w:rPr>
+        <w:t xml:space="preserve"> بر پایه تحلیل معنایی پتنت ها و متون غیر پتنت شروع نمودند. سپس پتنت ها را بر اساس موضوعات خوشه بندی کردند تا زیر حوزه های فناوری را بدست آورند، و در مرحله سوم با مدل سازی روابط میان خوشه ها توسط شبکه عصبی کانولوشنی گراف</w:t>
       </w:r>
       <w:r>
         <w:rPr>
@@ -49240,7 +49565,7 @@
           <w:rtl/>
           <w:lang w:bidi="fa-IR"/>
         </w:rPr>
-        <w:footnoteReference w:id="57"/>
+        <w:footnoteReference w:id="64"/>
       </w:r>
       <w:r>
         <w:rPr>
@@ -49614,7 +49939,16 @@
           <w:rtl/>
           <w:lang w:bidi="fa-IR"/>
         </w:rPr>
-        <w:t xml:space="preserve"> صورت گرفته است، با ترکیب تحلیل پتنت و شبکه‌ی معنایی-هم‌واژگانی و همچنین مدل سازی موضوعی، ساخت نقشه‌های هم‌واژگانی و استخراج موضوعات  وتدوین نقشه راه سه افق نزدیک، میانه و دور صورت گرفته است نیز دارای نتایج قابل توجهی است. در این مطالعه از 4113 پتنت در دو بازه‌ی زمانی 2001 الی 2012 و 2013 الی 2023 به عنوان جامعه‌ی آماری استفاده شده است. دلیل این تقسیم بندی مقایسه تحول خوشه‌ها در این دو دوری زمانی بوده‌است. این تحقیق موفق بود تا با </w:t>
+        <w:t xml:space="preserve"> صورت گرفته است، با ترکیب تحلیل پتنت و شبکه‌ی معنایی-هم‌واژگانی و همچنین مدل سازی موضوعی، ساخت نقشه‌های هم‌واژگانی و استخراج موضوعات  وتدوین نقشه راه سه افق نزدیک، میانه و دور صورت گرفته است نیز دارای </w:t>
+      </w:r>
+      <w:r>
+        <w:rPr>
+          <w:rFonts w:hint="cs"/>
+          <w:rtl/>
+          <w:lang w:bidi="fa-IR"/>
+        </w:rPr>
+        <w:lastRenderedPageBreak/>
+        <w:t xml:space="preserve">نتایج قابل توجهی است. در این مطالعه از 4113 پتنت در دو بازه‌ی زمانی 2001 الی 2012 و 2013 الی 2023 به عنوان جامعه‌ی آماری استفاده شده است. دلیل این تقسیم بندی مقایسه تحول خوشه‌ها در این دو دوری زمانی بوده‌است. این تحقیق موفق بود تا با </w:t>
       </w:r>
       <w:r>
         <w:rPr>
@@ -49818,7 +50152,7 @@
           <w:rtl/>
           <w:lang w:bidi="fa-IR"/>
         </w:rPr>
-        <w:footnoteReference w:id="58"/>
+        <w:footnoteReference w:id="65"/>
       </w:r>
       <w:r>
         <w:rPr>
@@ -49848,7 +50182,7 @@
           <w:rtl/>
           <w:lang w:bidi="fa-IR"/>
         </w:rPr>
-        <w:footnoteReference w:id="59"/>
+        <w:footnoteReference w:id="66"/>
       </w:r>
       <w:r>
         <w:rPr>
@@ -49878,7 +50212,7 @@
           <w:rtl/>
           <w:lang w:bidi="fa-IR"/>
         </w:rPr>
-        <w:footnoteReference w:id="60"/>
+        <w:footnoteReference w:id="67"/>
       </w:r>
       <w:r>
         <w:rPr>
@@ -49916,7 +50250,7 @@
           <w:rtl/>
           <w:lang w:bidi="fa-IR"/>
         </w:rPr>
-        <w:footnoteReference w:id="61"/>
+        <w:footnoteReference w:id="68"/>
       </w:r>
       <w:r>
         <w:rPr>
@@ -49962,7 +50296,7 @@
           <w:rtl/>
           <w:lang w:bidi="fa-IR"/>
         </w:rPr>
-        <w:footnoteReference w:id="62"/>
+        <w:footnoteReference w:id="69"/>
       </w:r>
       <w:r>
         <w:rPr>
@@ -50022,7 +50356,7 @@
           <w:rtl/>
           <w:lang w:bidi="fa-IR"/>
         </w:rPr>
-        <w:footnoteReference w:id="63"/>
+        <w:footnoteReference w:id="70"/>
       </w:r>
       <w:r>
         <w:rPr>
@@ -50083,7 +50417,7 @@
           <w:rtl/>
           <w:lang w:bidi="fa-IR"/>
         </w:rPr>
-        <w:footnoteReference w:id="64"/>
+        <w:footnoteReference w:id="71"/>
       </w:r>
       <w:r>
         <w:rPr>
@@ -50231,7 +50565,7 @@
           <w:rtl/>
           <w:lang w:bidi="fa-IR"/>
         </w:rPr>
-        <w:footnoteReference w:id="65"/>
+        <w:footnoteReference w:id="72"/>
       </w:r>
       <w:r>
         <w:rPr>
@@ -50247,24 +50581,15 @@
           <w:rtl/>
           <w:lang w:bidi="fa-IR"/>
         </w:rPr>
-        <w:footnoteReference w:id="66"/>
-      </w:r>
-      <w:r>
-        <w:rPr>
-          <w:rFonts w:hint="cs"/>
-          <w:rtl/>
-          <w:lang w:bidi="fa-IR"/>
-        </w:rPr>
-        <w:t xml:space="preserve"> برای تحلیل داده های پتنت و کشف الگو های پنهان و شبکه‌ی هم‌بستگی موضوعات در بدنه‌ی پتنت ها استفاده شده‌است. داده هایی که به عنوان ورودی استفاده شده‌است شامل 2398 پتنت منتشر شده در بازه 2017 الی 2023 می‌باشد. نتیجه‌ی این مطالعه شناسایی 6 حوزه کاربردی و کلیدی و سهم نسبی هر کدام بود. امنیت مالی-اطلاعاتی </w:t>
-      </w:r>
-      <w:r>
-        <w:rPr>
-          <w:rFonts w:hint="cs"/>
-          <w:rtl/>
-          <w:lang w:bidi="fa-IR"/>
-        </w:rPr>
-        <w:lastRenderedPageBreak/>
-        <w:t>22.28%، تولید و پردازش تصویر 21.7%، سامانه‌</w:t>
+        <w:footnoteReference w:id="73"/>
+      </w:r>
+      <w:r>
+        <w:rPr>
+          <w:rFonts w:hint="cs"/>
+          <w:rtl/>
+          <w:lang w:bidi="fa-IR"/>
+        </w:rPr>
+        <w:t xml:space="preserve"> برای تحلیل داده های پتنت و کشف الگو های پنهان و شبکه‌ی هم‌بستگی موضوعات در بدنه‌ی پتنت ها استفاده شده‌است. داده هایی که به عنوان ورودی استفاده شده‌است شامل 2398 پتنت منتشر شده در بازه 2017 الی 2023 می‌باشد. نتیجه‌ی این مطالعه شناسایی 6 حوزه کاربردی و کلیدی و سهم نسبی هر کدام بود. امنیت مالی-اطلاعاتی 22.28%، تولید و پردازش تصویر 21.7%، سامانه‌</w:t>
       </w:r>
       <w:r>
         <w:rPr>
@@ -50608,7 +50933,16 @@
           <w:rtl/>
           <w:lang w:bidi="fa-IR"/>
         </w:rPr>
-        <w:t xml:space="preserve"> و تکنیک های تحلیل پتنت، روند ها، خوشه های فناورانه و بازیگران را استخراج میکند و آن ها را به فرصت های قابل اقدام برای برنامه ریزی راهبردی و سیاست نوآوری نگاشت می‌کند. </w:t>
+        <w:t xml:space="preserve"> و تکنیک های تحلیل </w:t>
+      </w:r>
+      <w:r>
+        <w:rPr>
+          <w:rFonts w:hint="cs"/>
+          <w:rtl/>
+          <w:lang w:bidi="fa-IR"/>
+        </w:rPr>
+        <w:lastRenderedPageBreak/>
+        <w:t xml:space="preserve">پتنت، روند ها، خوشه های فناورانه و بازیگران را استخراج میکند و آن ها را به فرصت های قابل اقدام برای برنامه ریزی راهبردی و سیاست نوآوری نگاشت می‌کند. </w:t>
       </w:r>
       <w:r>
         <w:rPr>
@@ -51141,7 +51475,7 @@
           <w:rtl/>
           <w:lang w:bidi="fa-IR"/>
         </w:rPr>
-        <w:footnoteReference w:id="67"/>
+        <w:footnoteReference w:id="74"/>
       </w:r>
       <w:r>
         <w:rPr>
@@ -51161,7 +51495,7 @@
           <w:rStyle w:val="FootnoteReference"/>
           <w:lang w:bidi="fa-IR"/>
         </w:rPr>
-        <w:footnoteReference w:id="68"/>
+        <w:footnoteReference w:id="75"/>
       </w:r>
       <w:r>
         <w:rPr>
@@ -51181,7 +51515,7 @@
           <w:rStyle w:val="FootnoteReference"/>
           <w:lang w:bidi="fa-IR"/>
         </w:rPr>
-        <w:footnoteReference w:id="69"/>
+        <w:footnoteReference w:id="76"/>
       </w:r>
       <w:r>
         <w:rPr>
@@ -51201,7 +51535,7 @@
           <w:rStyle w:val="FootnoteReference"/>
           <w:lang w:bidi="fa-IR"/>
         </w:rPr>
-        <w:footnoteReference w:id="70"/>
+        <w:footnoteReference w:id="77"/>
       </w:r>
       <w:r>
         <w:rPr>
@@ -51322,15 +51656,7 @@
           <w:rtl/>
           <w:lang w:bidi="fa-IR"/>
         </w:rPr>
-        <w:t xml:space="preserve"> از جمله حد اشباع و بازه زماني داده حساس است. دوم، تکيه صرف بر پتنت ممکن است نوآوري هاي بدون ثبت يا تفاوت هاي نهادي و مقرراتي بازارها را بازتاب ندهد. سوم، تعريف دامنه فناوري و قواعد تجميع خانواده هاي پتنت مي </w:t>
-      </w:r>
-      <w:r>
-        <w:rPr>
-          <w:rtl/>
-          <w:lang w:bidi="fa-IR"/>
-        </w:rPr>
-        <w:lastRenderedPageBreak/>
-        <w:t>تواند بر رتبه بندي نهايي اثر بگذارد. با وجود اين قيود، مقاله نمونه اي روشن از کاربرد تحليل پتنت براي پيش بيني روند فناوري در حوزه سامانه هاي محرکه کم انتشار ارائه مي کند.</w:t>
+        <w:t xml:space="preserve"> از جمله حد اشباع و بازه زماني داده حساس است. دوم، تکيه صرف بر پتنت ممکن است نوآوري هاي بدون ثبت يا تفاوت هاي نهادي و مقرراتي بازارها را بازتاب ندهد. سوم، تعريف دامنه فناوري و قواعد تجميع خانواده هاي پتنت مي تواند بر رتبه بندي نهايي اثر بگذارد. با وجود اين قيود، مقاله نمونه اي روشن از کاربرد تحليل پتنت براي پيش بيني روند فناوري در حوزه سامانه هاي محرکه کم انتشار ارائه مي کند.</w:t>
       </w:r>
     </w:p>
     <w:p>
@@ -52449,6 +52775,7 @@
           <w:rtl/>
           <w:lang w:bidi="fa-IR"/>
         </w:rPr>
+        <w:lastRenderedPageBreak/>
         <w:t xml:space="preserve">ما و همکاران </w:t>
       </w:r>
       <w:r>
@@ -52910,7 +53237,6 @@
           <w:rFonts w:hint="cs"/>
           <w:rtl/>
         </w:rPr>
-        <w:lastRenderedPageBreak/>
         <w:t xml:space="preserve">در کنار مطالعاتی که پیش از این به بررسی آنها پرداختیم از تحلیل پتنت ها در جهت شناسایی فرصت های فناوری نیز استفاده می‌شود و این روش یکی از روش های جدید مورد استفاده و کارآمد به حساب می‌اید، برای نمونه لی و همکاران </w:t>
       </w:r>
       <w:r>
@@ -53154,7 +53480,14 @@
         <w:rPr>
           <w:rtl/>
         </w:rPr>
-        <w:t xml:space="preserve"> و محاسبه شباهت متني و با اتکا به نظريه چرخه عمر فناوري، موضوعات فناورانه از متن پتنت ها استخراج و مرحله رشد آنها توصيف شده است. خروجي مطالعه، تصويري از وضع موجود و روندهاي آتي ارائه مي کند و بر اولويت يافتن موضوع هايي چون نظريه بلاکچين، سامانه هاي معاملاتي، ساختار سامانه و سامانه هاي مالي هوشمند مبتني بر بلاکچين تاکيد دارد. نويسندگان به صورت ضمني بر حساسيت نتايج نسبت به پارامترهاي </w:t>
+        <w:t xml:space="preserve"> و محاسبه </w:t>
+      </w:r>
+      <w:r>
+        <w:rPr>
+          <w:rtl/>
+        </w:rPr>
+        <w:lastRenderedPageBreak/>
+        <w:t xml:space="preserve">شباهت متني و با اتکا به نظريه چرخه عمر فناوري، موضوعات فناورانه از متن پتنت ها استخراج و مرحله رشد آنها توصيف شده است. خروجي مطالعه، تصويري از وضع موجود و روندهاي آتي ارائه مي کند و بر اولويت يافتن موضوع هايي چون نظريه بلاکچين، سامانه هاي معاملاتي، ساختار سامانه و سامانه هاي مالي هوشمند مبتني بر بلاکچين تاکيد دارد. نويسندگان به صورت ضمني بر حساسيت نتايج نسبت به پارامترهاي </w:t>
       </w:r>
       <w:r>
         <w:t>LDA</w:t>
@@ -53291,7 +53624,7 @@
         <w:rPr>
           <w:rStyle w:val="FootnoteReference"/>
         </w:rPr>
-        <w:footnoteReference w:id="71"/>
+        <w:footnoteReference w:id="78"/>
       </w:r>
       <w:r>
         <w:rPr>
@@ -53336,7 +53669,7 @@
         <w:rPr>
           <w:rStyle w:val="FootnoteReference"/>
         </w:rPr>
-        <w:footnoteReference w:id="72"/>
+        <w:footnoteReference w:id="79"/>
       </w:r>
       <w:r>
         <w:rPr>
@@ -53395,7 +53728,7 @@
           <w:rStyle w:val="FootnoteReference"/>
           <w:rtl/>
         </w:rPr>
-        <w:footnoteReference w:id="73"/>
+        <w:footnoteReference w:id="80"/>
       </w:r>
       <w:r>
         <w:rPr>
@@ -53409,7 +53742,7 @@
           <w:rStyle w:val="FootnoteReference"/>
           <w:rtl/>
         </w:rPr>
-        <w:footnoteReference w:id="74"/>
+        <w:footnoteReference w:id="81"/>
       </w:r>
       <w:r>
         <w:rPr>
@@ -53450,7 +53783,6 @@
           <w:rFonts w:hint="cs"/>
           <w:rtl/>
         </w:rPr>
-        <w:lastRenderedPageBreak/>
         <w:t xml:space="preserve">جین و استیراستاوا </w:t>
       </w:r>
       <w:r>
@@ -53546,7 +53878,7 @@
           <w:rStyle w:val="FootnoteReference"/>
           <w:rtl/>
         </w:rPr>
-        <w:footnoteReference w:id="75"/>
+        <w:footnoteReference w:id="82"/>
       </w:r>
       <w:r>
         <w:rPr>
@@ -53659,7 +53991,7 @@
           <w:rtl/>
           <w:lang w:bidi="fa-IR"/>
         </w:rPr>
-        <w:footnoteReference w:id="76"/>
+        <w:footnoteReference w:id="83"/>
       </w:r>
       <w:r>
         <w:rPr>
@@ -53744,6 +54076,7 @@
           <w:rFonts w:hint="cs"/>
           <w:rtl/>
         </w:rPr>
+        <w:lastRenderedPageBreak/>
         <w:t>پیدل</w:t>
       </w:r>
       <w:r>
@@ -53823,7 +54156,7 @@
           <w:rStyle w:val="FootnoteReference"/>
           <w:rtl/>
         </w:rPr>
-        <w:footnoteReference w:id="77"/>
+        <w:footnoteReference w:id="84"/>
       </w:r>
       <w:r>
         <w:rPr>
@@ -53836,7 +54169,7 @@
           <w:rStyle w:val="FootnoteReference"/>
           <w:rtl/>
         </w:rPr>
-        <w:footnoteReference w:id="78"/>
+        <w:footnoteReference w:id="85"/>
       </w:r>
       <w:r>
         <w:rPr>
@@ -54060,7 +54393,7 @@
           <w:rStyle w:val="FootnoteReference"/>
           <w:rtl/>
         </w:rPr>
-        <w:footnoteReference w:id="79"/>
+        <w:footnoteReference w:id="86"/>
       </w:r>
       <w:r>
         <w:rPr>
@@ -61307,7 +61640,7 @@
                 <w:szCs w:val="24"/>
                 <w:rtl/>
               </w:rPr>
-              <w:footnoteReference w:id="80"/>
+              <w:footnoteReference w:id="87"/>
             </w:r>
             <w:r>
               <w:rPr>
@@ -61335,7 +61668,7 @@
                 <w:szCs w:val="24"/>
                 <w:rtl/>
               </w:rPr>
-              <w:footnoteReference w:id="81"/>
+              <w:footnoteReference w:id="88"/>
             </w:r>
             <w:r>
               <w:rPr>
@@ -61363,7 +61696,7 @@
                 <w:szCs w:val="24"/>
                 <w:rtl/>
               </w:rPr>
-              <w:footnoteReference w:id="82"/>
+              <w:footnoteReference w:id="89"/>
             </w:r>
             <w:r>
               <w:rPr>
@@ -61409,7 +61742,7 @@
                 <w:szCs w:val="24"/>
                 <w:rtl/>
               </w:rPr>
-              <w:footnoteReference w:id="83"/>
+              <w:footnoteReference w:id="90"/>
             </w:r>
             <w:r>
               <w:rPr>
@@ -62331,7 +62664,7 @@
                 <w:szCs w:val="24"/>
                 <w:lang w:val="en-US"/>
               </w:rPr>
-              <w:footnoteReference w:id="84"/>
+              <w:footnoteReference w:id="91"/>
             </w:r>
             <w:r>
               <w:rPr>
@@ -62765,7 +63098,29 @@
           <w:rtl/>
           <w:lang w:bidi="fa-IR"/>
         </w:rPr>
-        <w:t>در فصل سوم به مروری جامع بر چارچوب روش‌شناختی موجود در این پژوهش می‌پردازیم. این مطالعه با تمرکز بر تحلیل پتنت‌های موجود در حوزه خودروهای برقی در پی شناسایی خوشه‌های فناوری آن و همچنین بررسی چرخه عمر هر خوشه و ترسیم نقشه‌راه فناوری بر اساس این خوشه‌ها و روندهای موجود در این حوزه است. در این روش‌شناسی اهداف چندگانه</w:t>
+        <w:t>در فصل سوم به مروری جامع بر چارچوب روش‌شناختی موجود در این پژوهش می‌پردازیم. این مطالعه با تمرکز بر تحلیل پتنت‌های موجود در حوزه خودروهای برقی در پی شناسایی خوشه‌های فناوری آن و همچنین بررسی چرخه عمر هر خوشه و ترسیم نقشه‌راه فناوری بر اساس این خوشه‌ها و روندهای موجود در این حوزه است. در این روش‌شناسی</w:t>
+      </w:r>
+      <w:r>
+        <w:rPr>
+          <w:lang w:bidi="fa-IR"/>
+        </w:rPr>
+        <w:t xml:space="preserve"> </w:t>
+      </w:r>
+      <w:r>
+        <w:rPr>
+          <w:rFonts w:hint="cs"/>
+          <w:rtl/>
+          <w:lang w:bidi="fa-IR"/>
+        </w:rPr>
+        <w:t>که آمیخته‌ای از روش کمی و کیفی است،</w:t>
+      </w:r>
+      <w:r>
+        <w:rPr>
+          <w:rFonts w:hint="cs"/>
+          <w:rtl/>
+          <w:lang w:bidi="fa-IR"/>
+        </w:rPr>
+        <w:t xml:space="preserve"> اهداف چندگانه</w:t>
       </w:r>
       <w:r>
         <w:rPr>
@@ -62850,7 +63205,7 @@
           <w:rtl/>
           <w:lang w:bidi="fa-IR"/>
         </w:rPr>
-        <w:footnoteReference w:id="85"/>
+        <w:footnoteReference w:id="92"/>
       </w:r>
       <w:r>
         <w:rPr>
@@ -63076,7 +63431,7 @@
           <w:rtl/>
           <w:lang w:bidi="fa-IR"/>
         </w:rPr>
-        <w:footnoteReference w:id="86"/>
+        <w:footnoteReference w:id="93"/>
       </w:r>
       <w:r>
         <w:rPr>
@@ -63092,7 +63447,7 @@
           <w:rtl/>
           <w:lang w:bidi="fa-IR"/>
         </w:rPr>
-        <w:footnoteReference w:id="87"/>
+        <w:footnoteReference w:id="94"/>
       </w:r>
       <w:r>
         <w:rPr>
@@ -63215,7 +63570,7 @@
           <w:rtl/>
           <w:lang w:bidi="fa-IR"/>
         </w:rPr>
-        <w:footnoteReference w:id="88"/>
+        <w:footnoteReference w:id="95"/>
       </w:r>
       <w:r>
         <w:rPr>
@@ -63231,7 +63586,7 @@
           <w:rtl/>
           <w:lang w:bidi="fa-IR"/>
         </w:rPr>
-        <w:footnoteReference w:id="89"/>
+        <w:footnoteReference w:id="96"/>
       </w:r>
       <w:r>
         <w:rPr>
@@ -63315,7 +63670,6 @@
     <w:p>
       <w:pPr>
         <w:rPr>
-          <w:rFonts w:hint="cs"/>
           <w:rtl/>
           <w:lang w:bidi="fa-IR"/>
         </w:rPr>
@@ -63705,7 +64059,6 @@
           <w:numId w:val="13"/>
         </w:numPr>
         <w:rPr>
-          <w:rFonts w:hint="cs"/>
           <w:b/>
           <w:bCs/>
           <w:rtl/>
@@ -63747,7 +64100,7 @@
           <w:rtl/>
           <w:lang w:bidi="fa-IR"/>
         </w:rPr>
-        <w:footnoteReference w:id="90"/>
+        <w:footnoteReference w:id="97"/>
       </w:r>
       <w:r>
         <w:rPr>
@@ -63763,7 +64116,7 @@
           <w:rtl/>
           <w:lang w:bidi="fa-IR"/>
         </w:rPr>
-        <w:footnoteReference w:id="91"/>
+        <w:footnoteReference w:id="98"/>
       </w:r>
       <w:r>
         <w:rPr>
@@ -64110,7 +64463,7 @@
           <w:rtl/>
           <w:lang w:bidi="fa-IR"/>
         </w:rPr>
-        <w:footnoteReference w:id="92"/>
+        <w:footnoteReference w:id="99"/>
       </w:r>
       <w:r>
         <w:rPr>
@@ -64126,7 +64479,7 @@
           <w:rtl/>
           <w:lang w:bidi="fa-IR"/>
         </w:rPr>
-        <w:footnoteReference w:id="93"/>
+        <w:footnoteReference w:id="100"/>
       </w:r>
       <w:r>
         <w:rPr>
@@ -64142,7 +64495,7 @@
           <w:rtl/>
           <w:lang w:bidi="fa-IR"/>
         </w:rPr>
-        <w:footnoteReference w:id="94"/>
+        <w:footnoteReference w:id="101"/>
       </w:r>
       <w:r>
         <w:rPr>
@@ -64165,7 +64518,6 @@
     <w:p>
       <w:pPr>
         <w:rPr>
-          <w:rFonts w:hint="cs"/>
           <w:rtl/>
           <w:lang w:bidi="fa-IR"/>
         </w:rPr>
@@ -64215,7 +64567,6 @@
     <w:p>
       <w:pPr>
         <w:rPr>
-          <w:rtl/>
           <w:lang w:bidi="fa-IR"/>
         </w:rPr>
       </w:pPr>
@@ -64225,7 +64576,15 @@
           <w:rtl/>
           <w:lang w:bidi="fa-IR"/>
         </w:rPr>
-        <w:t>با استفاده از ماتریس هم‌رخدادی که در مرحله‌ی قبلی استخراج شده بود، به ساخت شبکه‌ی معنایی و بصری سازی آن پرداخته می‌شود. در حقیقت این عمل موجب آن است</w:t>
+        <w:t xml:space="preserve">با استفاده از ماتریس هم‌رخدادی که در مرحله‌ی قبلی استخراج شده بود، به ساخت شبکه‌ی معنایی و بصری سازی آن پرداخته می‌شود. </w:t>
+      </w:r>
+      <w:r>
+        <w:rPr>
+          <w:rFonts w:hint="cs"/>
+          <w:rtl/>
+          <w:lang w:bidi="fa-IR"/>
+        </w:rPr>
+        <w:t xml:space="preserve">این عمل با استفاده از نرم افزار گفی صورت میگیرد. در گراف ساخته شده هر گره نماینده یک کلیدواژه و هر یال بیانگر ارتباط دو کلیدواژه با یکدیگر است. وزن یال‌‌ها نیزنشان می‌دهد هر دو کلیدواژه چند مرتبطه در کنار یکدیگر قرار گرفته‌اند. این وزن علاوه بر این نشان می‌دهد که حوزه‌های مختلف فناوری تا چه میزان با یکدیگر ارتباط دارند. </w:t>
       </w:r>
     </w:p>
     <w:p>
@@ -64275,7 +64634,23 @@
           <w:rtl/>
           <w:lang w:bidi="fa-IR"/>
         </w:rPr>
-        <w:t>نام گذاری و تحلیل کیفی خوشه ها</w:t>
+        <w:t>نام گذاری خوشه ها</w:t>
+      </w:r>
+    </w:p>
+    <w:p>
+      <w:pPr>
+        <w:rPr>
+          <w:rtl/>
+          <w:lang w:bidi="fa-IR"/>
+        </w:rPr>
+      </w:pPr>
+      <w:r>
+        <w:rPr>
+          <w:rFonts w:hint="cs"/>
+          <w:rtl/>
+          <w:lang w:bidi="fa-IR"/>
+        </w:rPr>
+        <w:t xml:space="preserve">در این مرحله با توجه به سی کلمه‌ی پر تکرار هر خوشه، برای آن خوشه‌ی فناوری نام مناسبی اتخاذ گردید. ضمنا ارتباط میان نام‌ها و اعضای پرتکرار هر خوشه و همچنین ادغام خوشه‌های یکسان و مشابه به صورت دستی صورت گرفت تا نتایج از بالاترین دقت ممکن برخوردار باشند. </w:t>
       </w:r>
     </w:p>
     <w:p>
@@ -64297,6 +64672,29 @@
     </w:p>
     <w:p>
       <w:pPr>
+        <w:rPr>
+          <w:lang w:bidi="fa-IR"/>
+        </w:rPr>
+      </w:pPr>
+      <w:r>
+        <w:rPr>
+          <w:rFonts w:hint="cs"/>
+          <w:rtl/>
+          <w:lang w:bidi="fa-IR"/>
+        </w:rPr>
+        <w:t>پس از مرحله‌ی پیش پردازش متنی از خروجی این مرحله یک بار در جهت ساخت ماتریس هم‌رخدادی و یک بار در جهت نمایان کردن میزان تکرار هر کلمه در هر سال استفاده شد. به این صورت که با استفاده از کلاس شمارش در محیط برنامه‌نویسی پایتون، یک</w:t>
+      </w:r>
+      <w:r>
+        <w:rPr>
+          <w:rFonts w:hint="cs"/>
+          <w:rtl/>
+          <w:lang w:bidi="fa-IR"/>
+        </w:rPr>
+        <w:t xml:space="preserve"> خروجی با دو ستون ایجاد شد، در ستون اول کلمه‌‌ی کلیدواژه و در ستون دوم یک دیکشنری شامل داده‌هایی با دو مقدار سال و تکرار، از این خروجی می‌توان در جهت مشخص نمودن میزان تکرار هر کلمه در هر سال استفاده نمود. در ادامه با استفاده از این خروجی و تطابق آن با لغات موجود در هر خوشه‌ی بدست آمده خروجی دیگری استخراج شد که نشان میداد تمامی کلمات موجود در هر خوشه، مجموعا در هر سال چند مرتبه تکرار شده‌اند. از این داده بدست آمده در جهت برازش لجستیک چرخه عمر خوشه‌ها استفاده گردید. منحنی لجستیک نشان‌دهنده میزان رشد و اشباع میزان تکرار هر خوشه در هر سال است. </w:t>
+      </w:r>
+    </w:p>
+    <w:p>
+      <w:pPr>
         <w:pStyle w:val="Heading2"/>
         <w:rPr>
           <w:rtl/>
@@ -64309,6 +64707,7 @@
           <w:rtl/>
           <w:lang w:bidi="fa-IR"/>
         </w:rPr>
+        <w:lastRenderedPageBreak/>
         <w:t>ترسیم نقشه راه فناوری</w:t>
       </w:r>
     </w:p>
@@ -64364,6 +64763,86 @@
     </w:p>
     <w:p>
       <w:pPr>
+        <w:rPr>
+          <w:lang w:bidi="fa-IR"/>
+        </w:rPr>
+      </w:pPr>
+    </w:p>
+    <w:p>
+      <w:pPr>
+        <w:tabs>
+          <w:tab w:val="left" w:pos="4220"/>
+        </w:tabs>
+        <w:rPr>
+          <w:lang w:bidi="fa-IR"/>
+        </w:rPr>
+      </w:pPr>
+    </w:p>
+    <w:p>
+      <w:pPr>
+        <w:tabs>
+          <w:tab w:val="left" w:pos="4220"/>
+        </w:tabs>
+        <w:rPr>
+          <w:lang w:bidi="fa-IR"/>
+        </w:rPr>
+      </w:pPr>
+    </w:p>
+    <w:p>
+      <w:pPr>
+        <w:tabs>
+          <w:tab w:val="left" w:pos="4220"/>
+        </w:tabs>
+        <w:rPr>
+          <w:lang w:bidi="fa-IR"/>
+        </w:rPr>
+      </w:pPr>
+    </w:p>
+    <w:p>
+      <w:pPr>
+        <w:tabs>
+          <w:tab w:val="left" w:pos="4220"/>
+        </w:tabs>
+        <w:rPr>
+          <w:lang w:bidi="fa-IR"/>
+        </w:rPr>
+      </w:pPr>
+    </w:p>
+    <w:p>
+      <w:pPr>
+        <w:tabs>
+          <w:tab w:val="left" w:pos="4220"/>
+        </w:tabs>
+        <w:rPr>
+          <w:lang w:bidi="fa-IR"/>
+        </w:rPr>
+      </w:pPr>
+    </w:p>
+    <w:p>
+      <w:pPr>
+        <w:tabs>
+          <w:tab w:val="left" w:pos="4220"/>
+        </w:tabs>
+        <w:rPr>
+          <w:lang w:bidi="fa-IR"/>
+        </w:rPr>
+      </w:pPr>
+    </w:p>
+    <w:p>
+      <w:pPr>
+        <w:tabs>
+          <w:tab w:val="left" w:pos="4220"/>
+        </w:tabs>
+        <w:rPr>
+          <w:lang w:bidi="fa-IR"/>
+        </w:rPr>
+      </w:pPr>
+    </w:p>
+    <w:p>
+      <w:pPr>
+        <w:tabs>
+          <w:tab w:val="left" w:pos="4220"/>
+        </w:tabs>
         <w:rPr>
           <w:lang w:bidi="fa-IR"/>
         </w:rPr>
@@ -64372,10 +64851,6 @@
     <w:p>
       <w:pPr>
         <w:pStyle w:val="Heading1"/>
-        <w:numPr>
-          <w:ilvl w:val="0"/>
-          <w:numId w:val="0"/>
-        </w:numPr>
         <w:rPr>
           <w:rtl/>
           <w:lang w:bidi="fa-IR"/>
@@ -64383,12 +64858,322 @@
       </w:pPr>
       <w:r>
         <w:rPr>
+          <w:rFonts w:hint="cs"/>
           <w:rtl/>
           <w:lang w:bidi="fa-IR"/>
         </w:rPr>
         <w:lastRenderedPageBreak/>
-        <w:br w:type="page"/>
-      </w:r>
+        <w:t>فصل چهارم: تجزیه و تحلیل یافته</w:t>
+      </w:r>
+      <w:r>
+        <w:rPr>
+          <w:rFonts w:hint="eastAsia"/>
+          <w:rtl/>
+          <w:lang w:bidi="fa-IR"/>
+        </w:rPr>
+        <w:t>‌</w:t>
+      </w:r>
+      <w:r>
+        <w:rPr>
+          <w:rFonts w:hint="cs"/>
+          <w:rtl/>
+          <w:lang w:bidi="fa-IR"/>
+        </w:rPr>
+        <w:t>ها</w:t>
+      </w:r>
+    </w:p>
+    <w:p>
+      <w:pPr>
+        <w:pStyle w:val="Heading2"/>
+        <w:rPr>
+          <w:rtl/>
+          <w:lang w:bidi="fa-IR"/>
+        </w:rPr>
+      </w:pPr>
+      <w:r>
+        <w:rPr>
+          <w:rFonts w:hint="cs"/>
+          <w:rtl/>
+          <w:lang w:bidi="fa-IR"/>
+        </w:rPr>
+        <w:t>مقدمه</w:t>
+      </w:r>
+    </w:p>
+    <w:p>
+      <w:pPr>
+        <w:rPr>
+          <w:rtl/>
+          <w:lang w:bidi="fa-IR"/>
+        </w:rPr>
+      </w:pPr>
+      <w:r>
+        <w:rPr>
+          <w:rFonts w:hint="cs"/>
+          <w:rtl/>
+          <w:lang w:bidi="fa-IR"/>
+        </w:rPr>
+        <w:t>سلام این مقدمس</w:t>
+      </w:r>
+    </w:p>
+    <w:p>
+      <w:pPr>
+        <w:rPr>
+          <w:lang w:bidi="fa-IR"/>
+        </w:rPr>
+      </w:pPr>
+    </w:p>
+    <w:p>
+      <w:pPr>
+        <w:tabs>
+          <w:tab w:val="left" w:pos="4220"/>
+        </w:tabs>
+        <w:rPr>
+          <w:lang w:bidi="fa-IR"/>
+        </w:rPr>
+      </w:pPr>
+    </w:p>
+    <w:p>
+      <w:pPr>
+        <w:tabs>
+          <w:tab w:val="left" w:pos="4220"/>
+        </w:tabs>
+        <w:rPr>
+          <w:lang w:bidi="fa-IR"/>
+        </w:rPr>
+      </w:pPr>
+    </w:p>
+    <w:p>
+      <w:pPr>
+        <w:tabs>
+          <w:tab w:val="left" w:pos="4220"/>
+        </w:tabs>
+        <w:rPr>
+          <w:lang w:bidi="fa-IR"/>
+        </w:rPr>
+      </w:pPr>
+    </w:p>
+    <w:p>
+      <w:pPr>
+        <w:tabs>
+          <w:tab w:val="left" w:pos="4220"/>
+        </w:tabs>
+        <w:rPr>
+          <w:lang w:bidi="fa-IR"/>
+        </w:rPr>
+      </w:pPr>
+    </w:p>
+    <w:p>
+      <w:pPr>
+        <w:tabs>
+          <w:tab w:val="left" w:pos="4220"/>
+        </w:tabs>
+        <w:rPr>
+          <w:lang w:bidi="fa-IR"/>
+        </w:rPr>
+      </w:pPr>
+    </w:p>
+    <w:p>
+      <w:pPr>
+        <w:tabs>
+          <w:tab w:val="left" w:pos="4220"/>
+        </w:tabs>
+        <w:rPr>
+          <w:lang w:bidi="fa-IR"/>
+        </w:rPr>
+      </w:pPr>
+    </w:p>
+    <w:p>
+      <w:pPr>
+        <w:tabs>
+          <w:tab w:val="left" w:pos="4220"/>
+        </w:tabs>
+        <w:rPr>
+          <w:lang w:bidi="fa-IR"/>
+        </w:rPr>
+      </w:pPr>
+    </w:p>
+    <w:p>
+      <w:pPr>
+        <w:tabs>
+          <w:tab w:val="left" w:pos="4220"/>
+        </w:tabs>
+        <w:rPr>
+          <w:lang w:bidi="fa-IR"/>
+        </w:rPr>
+      </w:pPr>
+    </w:p>
+    <w:p>
+      <w:pPr>
+        <w:tabs>
+          <w:tab w:val="left" w:pos="4220"/>
+        </w:tabs>
+        <w:rPr>
+          <w:lang w:bidi="fa-IR"/>
+        </w:rPr>
+      </w:pPr>
+    </w:p>
+    <w:p>
+      <w:pPr>
+        <w:tabs>
+          <w:tab w:val="left" w:pos="4220"/>
+        </w:tabs>
+        <w:rPr>
+          <w:lang w:bidi="fa-IR"/>
+        </w:rPr>
+      </w:pPr>
+    </w:p>
+    <w:p>
+      <w:pPr>
+        <w:tabs>
+          <w:tab w:val="left" w:pos="4220"/>
+        </w:tabs>
+        <w:rPr>
+          <w:lang w:bidi="fa-IR"/>
+        </w:rPr>
+      </w:pPr>
+    </w:p>
+    <w:p>
+      <w:pPr>
+        <w:tabs>
+          <w:tab w:val="left" w:pos="4220"/>
+        </w:tabs>
+        <w:rPr>
+          <w:lang w:bidi="fa-IR"/>
+        </w:rPr>
+      </w:pPr>
+    </w:p>
+    <w:p>
+      <w:pPr>
+        <w:tabs>
+          <w:tab w:val="left" w:pos="4220"/>
+        </w:tabs>
+        <w:rPr>
+          <w:lang w:bidi="fa-IR"/>
+        </w:rPr>
+      </w:pPr>
+    </w:p>
+    <w:p>
+      <w:pPr>
+        <w:tabs>
+          <w:tab w:val="left" w:pos="4220"/>
+        </w:tabs>
+        <w:rPr>
+          <w:lang w:bidi="fa-IR"/>
+        </w:rPr>
+      </w:pPr>
+    </w:p>
+    <w:p>
+      <w:pPr>
+        <w:tabs>
+          <w:tab w:val="left" w:pos="4220"/>
+        </w:tabs>
+        <w:rPr>
+          <w:lang w:bidi="fa-IR"/>
+        </w:rPr>
+      </w:pPr>
+    </w:p>
+    <w:p>
+      <w:pPr>
+        <w:tabs>
+          <w:tab w:val="left" w:pos="4220"/>
+        </w:tabs>
+        <w:rPr>
+          <w:lang w:bidi="fa-IR"/>
+        </w:rPr>
+      </w:pPr>
+    </w:p>
+    <w:p>
+      <w:pPr>
+        <w:tabs>
+          <w:tab w:val="left" w:pos="4220"/>
+        </w:tabs>
+        <w:rPr>
+          <w:lang w:bidi="fa-IR"/>
+        </w:rPr>
+      </w:pPr>
+    </w:p>
+    <w:p>
+      <w:pPr>
+        <w:tabs>
+          <w:tab w:val="left" w:pos="4220"/>
+        </w:tabs>
+        <w:rPr>
+          <w:lang w:bidi="fa-IR"/>
+        </w:rPr>
+      </w:pPr>
+    </w:p>
+    <w:p>
+      <w:pPr>
+        <w:tabs>
+          <w:tab w:val="left" w:pos="4220"/>
+        </w:tabs>
+        <w:rPr>
+          <w:lang w:bidi="fa-IR"/>
+        </w:rPr>
+      </w:pPr>
+    </w:p>
+    <w:p>
+      <w:pPr>
+        <w:tabs>
+          <w:tab w:val="left" w:pos="4220"/>
+        </w:tabs>
+        <w:rPr>
+          <w:lang w:bidi="fa-IR"/>
+        </w:rPr>
+      </w:pPr>
+    </w:p>
+    <w:p>
+      <w:pPr>
+        <w:tabs>
+          <w:tab w:val="left" w:pos="4220"/>
+        </w:tabs>
+        <w:rPr>
+          <w:lang w:bidi="fa-IR"/>
+        </w:rPr>
+      </w:pPr>
+    </w:p>
+    <w:p>
+      <w:pPr>
+        <w:tabs>
+          <w:tab w:val="left" w:pos="4220"/>
+        </w:tabs>
+        <w:rPr>
+          <w:lang w:bidi="fa-IR"/>
+        </w:rPr>
+      </w:pPr>
+    </w:p>
+    <w:p>
+      <w:pPr>
+        <w:tabs>
+          <w:tab w:val="left" w:pos="4220"/>
+        </w:tabs>
+        <w:rPr>
+          <w:lang w:bidi="fa-IR"/>
+        </w:rPr>
+      </w:pPr>
+    </w:p>
+    <w:p>
+      <w:pPr>
+        <w:tabs>
+          <w:tab w:val="left" w:pos="4220"/>
+        </w:tabs>
+        <w:rPr>
+          <w:rtl/>
+          <w:lang w:bidi="fa-IR"/>
+        </w:rPr>
+        <w:sectPr>
+          <w:pgSz w:w="12240" w:h="15840"/>
+          <w:pgMar w:top="1440" w:right="1440" w:bottom="1440" w:left="1440" w:header="720" w:footer="720" w:gutter="0"/>
+          <w:pgBorders w:offsetFrom="page">
+            <w:top w:val="single" w:sz="4" w:space="24" w:color="auto"/>
+            <w:left w:val="single" w:sz="4" w:space="24" w:color="auto"/>
+            <w:bottom w:val="single" w:sz="4" w:space="24" w:color="auto"/>
+            <w:right w:val="single" w:sz="4" w:space="24" w:color="auto"/>
+          </w:pgBorders>
+          <w:cols w:space="720"/>
+          <w:docGrid w:linePitch="360"/>
+        </w:sectPr>
+      </w:pPr>
     </w:p>
     <w:p>
       <w:pPr>
@@ -68708,7 +69493,10 @@
         <w:t xml:space="preserve"> </w:t>
       </w:r>
       <w:r>
-        <w:t>Dynamic Capabilities</w:t>
+        <w:rPr>
+          <w:lang w:bidi="fa-IR"/>
+        </w:rPr>
+        <w:t>T-P-M</w:t>
       </w:r>
     </w:p>
   </w:footnote>
@@ -68716,6 +69504,10 @@
     <w:p>
       <w:pPr>
         <w:pStyle w:val="FootnoteText"/>
+        <w:rPr>
+          <w:rFonts w:hint="cs"/>
+          <w:lang w:bidi="fa-IR"/>
+        </w:rPr>
       </w:pPr>
       <w:r>
         <w:rPr>
@@ -68730,7 +69522,7 @@
         <w:t xml:space="preserve"> </w:t>
       </w:r>
       <w:r>
-        <w:t>Strategic Technology Management and Planning</w:t>
+        <w:t>Cambridge Roadmapping Toolkit</w:t>
       </w:r>
     </w:p>
   </w:footnote>
@@ -68739,6 +69531,7 @@
       <w:pPr>
         <w:pStyle w:val="FootnoteText"/>
         <w:rPr>
+          <w:rFonts w:hint="cs"/>
           <w:lang w:bidi="fa-IR"/>
         </w:rPr>
       </w:pPr>
@@ -68755,10 +69548,7 @@
         <w:t xml:space="preserve"> </w:t>
       </w:r>
       <w:r>
-        <w:rPr>
-          <w:szCs w:val="28"/>
-        </w:rPr>
-        <w:t>Nodes</w:t>
+        <w:t>Metamodel-based TRM</w:t>
       </w:r>
     </w:p>
   </w:footnote>
@@ -68767,6 +69557,7 @@
       <w:pPr>
         <w:pStyle w:val="FootnoteText"/>
         <w:rPr>
+          <w:rFonts w:hint="cs"/>
           <w:lang w:bidi="fa-IR"/>
         </w:rPr>
       </w:pPr>
@@ -68783,10 +69574,7 @@
         <w:t xml:space="preserve"> </w:t>
       </w:r>
       <w:r>
-        <w:rPr>
-          <w:szCs w:val="28"/>
-        </w:rPr>
-        <w:t>Edges</w:t>
+        <w:t>Digital Roadmapping</w:t>
       </w:r>
     </w:p>
   </w:footnote>
@@ -68795,6 +69583,7 @@
       <w:pPr>
         <w:pStyle w:val="FootnoteText"/>
         <w:rPr>
+          <w:rFonts w:hint="cs"/>
           <w:lang w:bidi="fa-IR"/>
         </w:rPr>
       </w:pPr>
@@ -68811,10 +69600,7 @@
         <w:t xml:space="preserve"> </w:t>
       </w:r>
       <w:r>
-        <w:rPr>
-          <w:szCs w:val="28"/>
-        </w:rPr>
-        <w:t>Social Network Analysis</w:t>
+        <w:t>Scenario-based &amp; AI-supported Roadmapping</w:t>
       </w:r>
     </w:p>
   </w:footnote>
@@ -68827,6 +69613,9 @@
         </w:rPr>
       </w:pPr>
       <w:r>
+        <w:t>Roadmapping</w:t>
+      </w:r>
+      <w:r>
         <w:rPr>
           <w:rStyle w:val="FootnoteReference"/>
         </w:rPr>
@@ -68839,10 +69628,24 @@
         <w:t xml:space="preserve"> </w:t>
       </w:r>
       <w:r>
-        <w:rPr>
-          <w:szCs w:val="28"/>
-        </w:rPr>
-        <w:t>Degree Centrality</w:t>
+        <w:t>Markov Decision Process</w:t>
+      </w:r>
+      <w:r>
+        <w:rPr>
+          <w:rFonts w:hint="cs"/>
+          <w:rtl/>
+        </w:rPr>
+        <w:t xml:space="preserve"> + </w:t>
+      </w:r>
+      <w:r>
+        <w:t>Monte Carlo Tree Search</w:t>
+      </w:r>
+      <w:r>
+        <w:rPr>
+          <w:rFonts w:hint="cs"/>
+          <w:rtl/>
+        </w:rPr>
+        <w:t xml:space="preserve"> </w:t>
       </w:r>
     </w:p>
   </w:footnote>
@@ -68851,6 +69654,7 @@
       <w:pPr>
         <w:pStyle w:val="FootnoteText"/>
         <w:rPr>
+          <w:rFonts w:hint="cs"/>
           <w:lang w:bidi="fa-IR"/>
         </w:rPr>
       </w:pPr>
@@ -68867,18 +69671,10 @@
         <w:t xml:space="preserve"> </w:t>
       </w:r>
       <w:r>
-        <w:t>Betweenness</w:t>
-      </w:r>
-      <w:r>
-        <w:rPr>
-          <w:rFonts w:ascii="Arial" w:eastAsiaTheme="minorHAnsi" w:hAnsi="Arial" w:cs="B Mitra"/>
-          <w:sz w:val="18"/>
-          <w:szCs w:val="28"/>
-        </w:rPr>
-        <w:t xml:space="preserve"> </w:t>
-      </w:r>
-      <w:r>
-        <w:t>Centrality</w:t>
+        <w:t>Gartner: Market-Pull / Technology-Push / Hybrid</w:t>
+      </w:r>
+      <w:r>
+        <w:t xml:space="preserve"> Roadmapping</w:t>
       </w:r>
     </w:p>
   </w:footnote>
@@ -68903,10 +69699,7 @@
         <w:t xml:space="preserve"> </w:t>
       </w:r>
       <w:r>
-        <w:rPr>
-          <w:szCs w:val="28"/>
-        </w:rPr>
-        <w:t>Modularity</w:t>
+        <w:t>Dynamic Capabilities</w:t>
       </w:r>
     </w:p>
   </w:footnote>
@@ -68914,9 +69707,6 @@
     <w:p>
       <w:pPr>
         <w:pStyle w:val="FootnoteText"/>
-        <w:rPr>
-          <w:lang w:bidi="fa-IR"/>
-        </w:rPr>
       </w:pPr>
       <w:r>
         <w:rPr>
@@ -68931,12 +69721,7 @@
         <w:t xml:space="preserve"> </w:t>
       </w:r>
       <w:r>
-        <w:rPr>
-          <w:rFonts w:hint="cs"/>
-          <w:rtl/>
-          <w:lang w:bidi="fa-IR"/>
-        </w:rPr>
-        <w:t>سرویس باز دفتر ثبت اختراع اروپا</w:t>
+        <w:t>Strategic Technology Management and Planning</w:t>
       </w:r>
     </w:p>
   </w:footnote>
@@ -68962,11 +69747,9 @@
       </w:r>
       <w:r>
         <w:rPr>
-          <w:rFonts w:hint="cs"/>
-          <w:rtl/>
-          <w:lang w:bidi="fa-IR"/>
-        </w:rPr>
-        <w:t>رده بندی مشترک ثبت اختراع</w:t>
+          <w:szCs w:val="28"/>
+        </w:rPr>
+        <w:t>Nodes</w:t>
       </w:r>
     </w:p>
   </w:footnote>
@@ -68991,7 +69774,10 @@
         <w:t xml:space="preserve"> </w:t>
       </w:r>
       <w:r>
-        <w:t>Li-ion</w:t>
+        <w:rPr>
+          <w:szCs w:val="28"/>
+        </w:rPr>
+        <w:t>Edges</w:t>
       </w:r>
     </w:p>
   </w:footnote>
@@ -69016,7 +69802,10 @@
         <w:t xml:space="preserve"> </w:t>
       </w:r>
       <w:r>
-        <w:t>AWE</w:t>
+        <w:rPr>
+          <w:szCs w:val="28"/>
+        </w:rPr>
+        <w:t>Social Network Analysis</w:t>
       </w:r>
     </w:p>
   </w:footnote>
@@ -69041,7 +69830,10 @@
         <w:t xml:space="preserve"> </w:t>
       </w:r>
       <w:r>
-        <w:t>Bioenergy</w:t>
+        <w:rPr>
+          <w:szCs w:val="28"/>
+        </w:rPr>
+        <w:t>Degree Centrality</w:t>
       </w:r>
     </w:p>
   </w:footnote>
@@ -69066,12 +69858,18 @@
         <w:t xml:space="preserve"> </w:t>
       </w:r>
       <w:r>
-        <w:rPr>
-          <w:rFonts w:hint="cs"/>
-          <w:rtl/>
-          <w:lang w:bidi="fa-IR"/>
-        </w:rPr>
-        <w:t>تولید ناخالص داخلی بر پایه برابری قدرت خرید</w:t>
+        <w:t>Betweenness</w:t>
+      </w:r>
+      <w:r>
+        <w:rPr>
+          <w:rFonts w:ascii="Arial" w:eastAsiaTheme="minorHAnsi" w:hAnsi="Arial" w:cs="B Mitra"/>
+          <w:sz w:val="18"/>
+          <w:szCs w:val="28"/>
+        </w:rPr>
+        <w:t xml:space="preserve"> </w:t>
+      </w:r>
+      <w:r>
+        <w:t>Centrality</w:t>
       </w:r>
     </w:p>
   </w:footnote>
@@ -69096,7 +69894,10 @@
         <w:t xml:space="preserve"> </w:t>
       </w:r>
       <w:r>
-        <w:t>Patent Family Size</w:t>
+        <w:rPr>
+          <w:szCs w:val="28"/>
+        </w:rPr>
+        <w:t>Modularity</w:t>
       </w:r>
     </w:p>
   </w:footnote>
@@ -69121,7 +69922,12 @@
         <w:t xml:space="preserve"> </w:t>
       </w:r>
       <w:r>
-        <w:t>Patent Claims</w:t>
+        <w:rPr>
+          <w:rFonts w:hint="cs"/>
+          <w:rtl/>
+          <w:lang w:bidi="fa-IR"/>
+        </w:rPr>
+        <w:t>سرویس باز دفتر ثبت اختراع اروپا</w:t>
       </w:r>
     </w:p>
   </w:footnote>
@@ -69146,7 +69952,12 @@
         <w:t xml:space="preserve"> </w:t>
       </w:r>
       <w:r>
-        <w:t>T&amp;D-Mechanism</w:t>
+        <w:rPr>
+          <w:rFonts w:hint="cs"/>
+          <w:rtl/>
+          <w:lang w:bidi="fa-IR"/>
+        </w:rPr>
+        <w:t>رده بندی مشترک ثبت اختراع</w:t>
       </w:r>
     </w:p>
   </w:footnote>
@@ -69171,7 +69982,7 @@
         <w:t xml:space="preserve"> </w:t>
       </w:r>
       <w:r>
-        <w:t>TDC</w:t>
+        <w:t>Li-ion</w:t>
       </w:r>
     </w:p>
   </w:footnote>
@@ -69180,7 +69991,6 @@
       <w:pPr>
         <w:pStyle w:val="FootnoteText"/>
         <w:rPr>
-          <w:rtl/>
           <w:lang w:bidi="fa-IR"/>
         </w:rPr>
       </w:pPr>
@@ -69197,10 +70007,7 @@
         <w:t xml:space="preserve"> </w:t>
       </w:r>
       <w:r>
-        <w:rPr>
-          <w:lang w:bidi="fa-IR"/>
-        </w:rPr>
-        <w:t>TEC</w:t>
+        <w:t>AWE</w:t>
       </w:r>
     </w:p>
   </w:footnote>
@@ -69225,10 +70032,7 @@
         <w:t xml:space="preserve"> </w:t>
       </w:r>
       <w:r>
-        <w:rPr>
-          <w:lang w:bidi="fa-IR"/>
-        </w:rPr>
-        <w:t>B5G</w:t>
+        <w:t>Bioenergy</w:t>
       </w:r>
     </w:p>
   </w:footnote>
@@ -69253,7 +70057,12 @@
         <w:t xml:space="preserve"> </w:t>
       </w:r>
       <w:r>
-        <w:t>Ontology</w:t>
+        <w:rPr>
+          <w:rFonts w:hint="cs"/>
+          <w:rtl/>
+          <w:lang w:bidi="fa-IR"/>
+        </w:rPr>
+        <w:t>تولید ناخالص داخلی بر پایه برابری قدرت خرید</w:t>
       </w:r>
     </w:p>
   </w:footnote>
@@ -69278,10 +70087,7 @@
         <w:t xml:space="preserve"> </w:t>
       </w:r>
       <w:r>
-        <w:rPr>
-          <w:lang w:bidi="fa-IR"/>
-        </w:rPr>
-        <w:t>GCN</w:t>
+        <w:t>Patent Family Size</w:t>
       </w:r>
     </w:p>
   </w:footnote>
@@ -69306,11 +70112,7 @@
         <w:t xml:space="preserve"> </w:t>
       </w:r>
       <w:r>
-        <w:rPr>
-          <w:szCs w:val="28"/>
-          <w:lang w:bidi="fa-IR"/>
-        </w:rPr>
-        <w:t>User experience</w:t>
+        <w:t>Patent Claims</w:t>
       </w:r>
     </w:p>
   </w:footnote>
@@ -69335,11 +70137,7 @@
         <w:t xml:space="preserve"> </w:t>
       </w:r>
       <w:r>
-        <w:rPr>
-          <w:szCs w:val="28"/>
-          <w:lang w:bidi="fa-IR"/>
-        </w:rPr>
-        <w:t>Integrating devices</w:t>
+        <w:t>T&amp;D-Mechanism</w:t>
       </w:r>
     </w:p>
   </w:footnote>
@@ -69364,11 +70162,7 @@
         <w:t xml:space="preserve"> </w:t>
       </w:r>
       <w:r>
-        <w:rPr>
-          <w:szCs w:val="28"/>
-          <w:lang w:bidi="fa-IR"/>
-        </w:rPr>
-        <w:t>Product information management</w:t>
+        <w:t>TDC</w:t>
       </w:r>
     </w:p>
   </w:footnote>
@@ -69377,6 +70171,7 @@
       <w:pPr>
         <w:pStyle w:val="FootnoteText"/>
         <w:rPr>
+          <w:rtl/>
           <w:lang w:bidi="fa-IR"/>
         </w:rPr>
       </w:pPr>
@@ -69394,10 +70189,9 @@
       </w:r>
       <w:r>
         <w:rPr>
-          <w:szCs w:val="28"/>
-          <w:lang w:bidi="fa-IR"/>
-        </w:rPr>
-        <w:t>E-commerce infrastructure</w:t>
+          <w:lang w:bidi="fa-IR"/>
+        </w:rPr>
+        <w:t>TEC</w:t>
       </w:r>
     </w:p>
   </w:footnote>
@@ -69423,10 +70217,9 @@
       </w:r>
       <w:r>
         <w:rPr>
-          <w:szCs w:val="28"/>
-          <w:lang w:bidi="fa-IR"/>
-        </w:rPr>
-        <w:t>Advanced e-commerce authentication</w:t>
+          <w:lang w:bidi="fa-IR"/>
+        </w:rPr>
+        <w:t>B5G</w:t>
       </w:r>
     </w:p>
   </w:footnote>
@@ -69451,11 +70244,7 @@
         <w:t xml:space="preserve"> </w:t>
       </w:r>
       <w:r>
-        <w:rPr>
-          <w:szCs w:val="28"/>
-          <w:lang w:bidi="fa-IR"/>
-        </w:rPr>
-        <w:t>Pricing &amp; payment solution</w:t>
+        <w:t>Ontology</w:t>
       </w:r>
     </w:p>
   </w:footnote>
@@ -69481,17 +70270,9 @@
       </w:r>
       <w:r>
         <w:rPr>
-          <w:szCs w:val="28"/>
-          <w:lang w:bidi="fa-IR"/>
-        </w:rPr>
-        <w:t>Platform development &amp; e-commerce optimizatio</w:t>
-      </w:r>
-      <w:r>
-        <w:rPr>
-          <w:szCs w:val="28"/>
-          <w:lang w:bidi="fa-IR"/>
-        </w:rPr>
-        <w:t>n</w:t>
+          <w:lang w:bidi="fa-IR"/>
+        </w:rPr>
+        <w:t>GCN</w:t>
       </w:r>
     </w:p>
   </w:footnote>
@@ -69517,9 +70298,10 @@
       </w:r>
       <w:r>
         <w:rPr>
-          <w:lang w:bidi="fa-IR"/>
-        </w:rPr>
-        <w:t>Generative AI</w:t>
+          <w:szCs w:val="28"/>
+          <w:lang w:bidi="fa-IR"/>
+        </w:rPr>
+        <w:t>User experience</w:t>
       </w:r>
     </w:p>
   </w:footnote>
@@ -69544,7 +70326,11 @@
         <w:t xml:space="preserve"> </w:t>
       </w:r>
       <w:r>
-        <w:t>Structural Topic Modeling; STM</w:t>
+        <w:rPr>
+          <w:szCs w:val="28"/>
+          <w:lang w:bidi="fa-IR"/>
+        </w:rPr>
+        <w:t>Integrating devices</w:t>
       </w:r>
     </w:p>
   </w:footnote>
@@ -69570,9 +70356,10 @@
       </w:r>
       <w:r>
         <w:rPr>
-          <w:lang w:bidi="fa-IR"/>
-        </w:rPr>
-        <w:t>Entropy weighting</w:t>
+          <w:szCs w:val="28"/>
+          <w:lang w:bidi="fa-IR"/>
+        </w:rPr>
+        <w:t>Product information management</w:t>
       </w:r>
     </w:p>
   </w:footnote>
@@ -69598,11 +70385,10 @@
       </w:r>
       <w:r>
         <w:rPr>
-          <w:rFonts w:hint="cs"/>
-          <w:rtl/>
-          <w:lang w:bidi="fa-IR"/>
-        </w:rPr>
-        <w:t>خودروی هیبریدی</w:t>
+          <w:szCs w:val="28"/>
+          <w:lang w:bidi="fa-IR"/>
+        </w:rPr>
+        <w:t>E-commerce infrastructure</w:t>
       </w:r>
     </w:p>
   </w:footnote>
@@ -69628,11 +70414,10 @@
       </w:r>
       <w:r>
         <w:rPr>
-          <w:rFonts w:hint="cs"/>
-          <w:rtl/>
-          <w:lang w:bidi="fa-IR"/>
-        </w:rPr>
-        <w:t>خودروی برقی باتری محور</w:t>
+          <w:szCs w:val="28"/>
+          <w:lang w:bidi="fa-IR"/>
+        </w:rPr>
+        <w:t>Advanced e-commerce authentication</w:t>
       </w:r>
     </w:p>
   </w:footnote>
@@ -69658,11 +70443,10 @@
       </w:r>
       <w:r>
         <w:rPr>
-          <w:rFonts w:hint="cs"/>
-          <w:rtl/>
-          <w:lang w:bidi="fa-IR"/>
-        </w:rPr>
-        <w:t>خودروی پیل سوختی</w:t>
+          <w:szCs w:val="28"/>
+          <w:lang w:bidi="fa-IR"/>
+        </w:rPr>
+        <w:t>Pricing &amp; payment solution</w:t>
       </w:r>
     </w:p>
   </w:footnote>
@@ -69670,6 +70454,9 @@
     <w:p>
       <w:pPr>
         <w:pStyle w:val="FootnoteText"/>
+        <w:rPr>
+          <w:lang w:bidi="fa-IR"/>
+        </w:rPr>
       </w:pPr>
       <w:r>
         <w:rPr>
@@ -69684,7 +70471,18 @@
         <w:t xml:space="preserve"> </w:t>
       </w:r>
       <w:r>
-        <w:t>Hybrid Electric Vehicles</w:t>
+        <w:rPr>
+          <w:szCs w:val="28"/>
+          <w:lang w:bidi="fa-IR"/>
+        </w:rPr>
+        <w:t>Platform development &amp; e-commerce optimizatio</w:t>
+      </w:r>
+      <w:r>
+        <w:rPr>
+          <w:szCs w:val="28"/>
+          <w:lang w:bidi="fa-IR"/>
+        </w:rPr>
+        <w:t>n</w:t>
       </w:r>
     </w:p>
   </w:footnote>
@@ -69692,6 +70490,9 @@
     <w:p>
       <w:pPr>
         <w:pStyle w:val="FootnoteText"/>
+        <w:rPr>
+          <w:lang w:bidi="fa-IR"/>
+        </w:rPr>
       </w:pPr>
       <w:r>
         <w:rPr>
@@ -69706,7 +70507,10 @@
         <w:t xml:space="preserve"> </w:t>
       </w:r>
       <w:r>
-        <w:t>Energy Management Strategies</w:t>
+        <w:rPr>
+          <w:lang w:bidi="fa-IR"/>
+        </w:rPr>
+        <w:t>Generative AI</w:t>
       </w:r>
     </w:p>
   </w:footnote>
@@ -69731,7 +70535,7 @@
         <w:t xml:space="preserve"> </w:t>
       </w:r>
       <w:r>
-        <w:t>Machine Learning</w:t>
+        <w:t>Structural Topic Modeling; STM</w:t>
       </w:r>
     </w:p>
   </w:footnote>
@@ -69756,7 +70560,10 @@
         <w:t xml:space="preserve"> </w:t>
       </w:r>
       <w:r>
-        <w:t>Reinforcement Learning</w:t>
+        <w:rPr>
+          <w:lang w:bidi="fa-IR"/>
+        </w:rPr>
+        <w:t>Entropy weighting</w:t>
       </w:r>
     </w:p>
   </w:footnote>
@@ -69781,7 +70588,12 @@
         <w:t xml:space="preserve"> </w:t>
       </w:r>
       <w:r>
-        <w:t>Battery Electric Vehicle</w:t>
+        <w:rPr>
+          <w:rFonts w:hint="cs"/>
+          <w:rtl/>
+          <w:lang w:bidi="fa-IR"/>
+        </w:rPr>
+        <w:t>خودروی هیبریدی</w:t>
       </w:r>
     </w:p>
   </w:footnote>
@@ -69807,15 +70619,11 @@
       </w:r>
       <w:r>
         <w:rPr>
-          <w:lang w:bidi="fa-IR"/>
-        </w:rPr>
-        <w:t>I</w:t>
-      </w:r>
-      <w:r>
-        <w:rPr>
-          <w:lang w:bidi="fa-IR"/>
-        </w:rPr>
-        <w:t>nternational Patent Classification</w:t>
+          <w:rFonts w:hint="cs"/>
+          <w:rtl/>
+          <w:lang w:bidi="fa-IR"/>
+        </w:rPr>
+        <w:t>خودروی برقی باتری محور</w:t>
       </w:r>
     </w:p>
   </w:footnote>
@@ -69840,7 +70648,12 @@
         <w:t xml:space="preserve"> </w:t>
       </w:r>
       <w:r>
-        <w:t>Heavy-Duty Vehicles</w:t>
+        <w:rPr>
+          <w:rFonts w:hint="cs"/>
+          <w:rtl/>
+          <w:lang w:bidi="fa-IR"/>
+        </w:rPr>
+        <w:t>خودروی پیل سوختی</w:t>
       </w:r>
     </w:p>
   </w:footnote>
@@ -69848,9 +70661,6 @@
     <w:p>
       <w:pPr>
         <w:pStyle w:val="FootnoteText"/>
-        <w:rPr>
-          <w:lang w:bidi="fa-IR"/>
-        </w:rPr>
       </w:pPr>
       <w:r>
         <w:rPr>
@@ -69865,7 +70675,7 @@
         <w:t xml:space="preserve"> </w:t>
       </w:r>
       <w:r>
-        <w:t>Technology Readiness Level</w:t>
+        <w:t>Hybrid Electric Vehicles</w:t>
       </w:r>
     </w:p>
   </w:footnote>
@@ -69887,7 +70697,7 @@
         <w:t xml:space="preserve"> </w:t>
       </w:r>
       <w:r>
-        <w:t>Megawatt Charging System</w:t>
+        <w:t>Energy Management Strategies</w:t>
       </w:r>
     </w:p>
   </w:footnote>
@@ -69912,17 +70722,7 @@
         <w:t xml:space="preserve"> </w:t>
       </w:r>
       <w:r>
-        <w:t>Equivalent Consumption Minimization Strategy</w:t>
-      </w:r>
-      <w:r>
-        <w:rPr>
-          <w:rFonts w:hint="cs"/>
-          <w:rtl/>
-        </w:rPr>
-        <w:t>:</w:t>
-      </w:r>
-      <w:r>
-        <w:t xml:space="preserve"> ECMS</w:t>
+        <w:t>Machine Learning</w:t>
       </w:r>
     </w:p>
   </w:footnote>
@@ -69947,7 +70747,7 @@
         <w:t xml:space="preserve"> </w:t>
       </w:r>
       <w:r>
-        <w:t>Dynamic Programming</w:t>
+        <w:t>Reinforcement Learning</w:t>
       </w:r>
     </w:p>
   </w:footnote>
@@ -69956,7 +70756,6 @@
       <w:pPr>
         <w:pStyle w:val="FootnoteText"/>
         <w:rPr>
-          <w:rtl/>
           <w:lang w:bidi="fa-IR"/>
         </w:rPr>
       </w:pPr>
@@ -69973,10 +70772,7 @@
         <w:t xml:space="preserve"> </w:t>
       </w:r>
       <w:r>
-        <w:t>Model Predictive Contro</w:t>
-      </w:r>
-      <w:r>
-        <w:t>l</w:t>
+        <w:t>Battery Electric Vehicle</w:t>
       </w:r>
     </w:p>
   </w:footnote>
@@ -70001,7 +70797,16 @@
         <w:t xml:space="preserve"> </w:t>
       </w:r>
       <w:r>
-        <w:t>Deep Reinforcement Learning</w:t>
+        <w:rPr>
+          <w:lang w:bidi="fa-IR"/>
+        </w:rPr>
+        <w:t>I</w:t>
+      </w:r>
+      <w:r>
+        <w:rPr>
+          <w:lang w:bidi="fa-IR"/>
+        </w:rPr>
+        <w:t>nternational Patent Classification</w:t>
       </w:r>
     </w:p>
   </w:footnote>
@@ -70026,22 +70831,7 @@
         <w:t xml:space="preserve"> </w:t>
       </w:r>
       <w:r>
-        <w:t>Fast</w:t>
-      </w:r>
-      <w:r>
-        <w:t xml:space="preserve"> and Smart charging solutions for full size U</w:t>
-      </w:r>
-      <w:r>
-        <w:t>r</w:t>
-      </w:r>
-      <w:r>
-        <w:t xml:space="preserve">ban </w:t>
-      </w:r>
-      <w:r>
-        <w:t>He</w:t>
-      </w:r>
-      <w:r>
-        <w:t>avy Duty applications</w:t>
+        <w:t>Heavy-Duty Vehicles</w:t>
       </w:r>
     </w:p>
   </w:footnote>
@@ -70066,10 +70856,7 @@
         <w:t xml:space="preserve"> </w:t>
       </w:r>
       <w:r>
-        <w:rPr>
-          <w:lang w:bidi="fa-IR"/>
-        </w:rPr>
-        <w:t>Lens.org</w:t>
+        <w:t>Technology Readiness Level</w:t>
       </w:r>
     </w:p>
   </w:footnote>
@@ -70077,9 +70864,6 @@
     <w:p>
       <w:pPr>
         <w:pStyle w:val="FootnoteText"/>
-        <w:rPr>
-          <w:lang w:bidi="fa-IR"/>
-        </w:rPr>
       </w:pPr>
       <w:r>
         <w:rPr>
@@ -70094,10 +70878,7 @@
         <w:t xml:space="preserve"> </w:t>
       </w:r>
       <w:r>
-        <w:rPr>
-          <w:lang w:bidi="fa-IR"/>
-        </w:rPr>
-        <w:t>USPTO</w:t>
+        <w:t>Megawatt Charging System</w:t>
       </w:r>
     </w:p>
   </w:footnote>
@@ -70105,6 +70886,9 @@
     <w:p>
       <w:pPr>
         <w:pStyle w:val="FootnoteText"/>
+        <w:rPr>
+          <w:lang w:bidi="fa-IR"/>
+        </w:rPr>
       </w:pPr>
       <w:r>
         <w:rPr>
@@ -70119,7 +70903,17 @@
         <w:t xml:space="preserve"> </w:t>
       </w:r>
       <w:r>
-        <w:t>EPO</w:t>
+        <w:t>Equivalent Consumption Minimization Strategy</w:t>
+      </w:r>
+      <w:r>
+        <w:rPr>
+          <w:rFonts w:hint="cs"/>
+          <w:rtl/>
+        </w:rPr>
+        <w:t>:</w:t>
+      </w:r>
+      <w:r>
+        <w:t xml:space="preserve"> ECMS</w:t>
       </w:r>
     </w:p>
   </w:footnote>
@@ -70144,10 +70938,7 @@
         <w:t xml:space="preserve"> </w:t>
       </w:r>
       <w:r>
-        <w:rPr>
-          <w:lang w:bidi="fa-IR"/>
-        </w:rPr>
-        <w:t>Electric vehicle</w:t>
+        <w:t>Dynamic Programming</w:t>
       </w:r>
     </w:p>
   </w:footnote>
@@ -70155,6 +70946,10 @@
     <w:p>
       <w:pPr>
         <w:pStyle w:val="FootnoteText"/>
+        <w:rPr>
+          <w:rtl/>
+          <w:lang w:bidi="fa-IR"/>
+        </w:rPr>
       </w:pPr>
       <w:r>
         <w:rPr>
@@ -70169,7 +70964,10 @@
         <w:t xml:space="preserve"> </w:t>
       </w:r>
       <w:r>
-        <w:t>Electric vehicles</w:t>
+        <w:t>Model Predictive Contro</w:t>
+      </w:r>
+      <w:r>
+        <w:t>l</w:t>
       </w:r>
     </w:p>
   </w:footnote>
@@ -70194,10 +70992,7 @@
         <w:t xml:space="preserve"> </w:t>
       </w:r>
       <w:r>
-        <w:rPr>
-          <w:lang w:bidi="fa-IR"/>
-        </w:rPr>
-        <w:t>Title&amp;Abstract</w:t>
+        <w:t>Deep Reinforcement Learning</w:t>
       </w:r>
     </w:p>
   </w:footnote>
@@ -70222,10 +71017,22 @@
         <w:t xml:space="preserve"> </w:t>
       </w:r>
       <w:r>
-        <w:rPr>
-          <w:lang w:bidi="fa-IR"/>
-        </w:rPr>
-        <w:t>Null</w:t>
+        <w:t>Fast</w:t>
+      </w:r>
+      <w:r>
+        <w:t xml:space="preserve"> and Smart charging solutions for full size U</w:t>
+      </w:r>
+      <w:r>
+        <w:t>r</w:t>
+      </w:r>
+      <w:r>
+        <w:t xml:space="preserve">ban </w:t>
+      </w:r>
+      <w:r>
+        <w:t>He</w:t>
+      </w:r>
+      <w:r>
+        <w:t>avy Duty applications</w:t>
       </w:r>
     </w:p>
   </w:footnote>
@@ -70234,8 +71041,6 @@
       <w:pPr>
         <w:pStyle w:val="FootnoteText"/>
         <w:rPr>
-          <w:rFonts w:hint="cs"/>
-          <w:rtl/>
           <w:lang w:bidi="fa-IR"/>
         </w:rPr>
       </w:pPr>
@@ -70255,7 +71060,7 @@
         <w:rPr>
           <w:lang w:bidi="fa-IR"/>
         </w:rPr>
-        <w:t>source</w:t>
+        <w:t>Lens.org</w:t>
       </w:r>
     </w:p>
   </w:footnote>
@@ -70283,11 +71088,196 @@
         <w:rPr>
           <w:lang w:bidi="fa-IR"/>
         </w:rPr>
-        <w:t>target</w:t>
+        <w:t>USPTO</w:t>
       </w:r>
     </w:p>
   </w:footnote>
   <w:footnote w:id="94">
+    <w:p>
+      <w:pPr>
+        <w:pStyle w:val="FootnoteText"/>
+      </w:pPr>
+      <w:r>
+        <w:rPr>
+          <w:rStyle w:val="FootnoteReference"/>
+        </w:rPr>
+        <w:footnoteRef/>
+      </w:r>
+      <w:r>
+        <w:rPr>
+          <w:rtl/>
+        </w:rPr>
+        <w:t xml:space="preserve"> </w:t>
+      </w:r>
+      <w:r>
+        <w:t>EPO</w:t>
+      </w:r>
+    </w:p>
+  </w:footnote>
+  <w:footnote w:id="95">
+    <w:p>
+      <w:pPr>
+        <w:pStyle w:val="FootnoteText"/>
+        <w:rPr>
+          <w:lang w:bidi="fa-IR"/>
+        </w:rPr>
+      </w:pPr>
+      <w:r>
+        <w:rPr>
+          <w:rStyle w:val="FootnoteReference"/>
+        </w:rPr>
+        <w:footnoteRef/>
+      </w:r>
+      <w:r>
+        <w:rPr>
+          <w:rtl/>
+        </w:rPr>
+        <w:t xml:space="preserve"> </w:t>
+      </w:r>
+      <w:r>
+        <w:rPr>
+          <w:lang w:bidi="fa-IR"/>
+        </w:rPr>
+        <w:t>Electric vehicle</w:t>
+      </w:r>
+    </w:p>
+  </w:footnote>
+  <w:footnote w:id="96">
+    <w:p>
+      <w:pPr>
+        <w:pStyle w:val="FootnoteText"/>
+      </w:pPr>
+      <w:r>
+        <w:rPr>
+          <w:rStyle w:val="FootnoteReference"/>
+        </w:rPr>
+        <w:footnoteRef/>
+      </w:r>
+      <w:r>
+        <w:rPr>
+          <w:rtl/>
+        </w:rPr>
+        <w:t xml:space="preserve"> </w:t>
+      </w:r>
+      <w:r>
+        <w:t>Electric vehicles</w:t>
+      </w:r>
+    </w:p>
+  </w:footnote>
+  <w:footnote w:id="97">
+    <w:p>
+      <w:pPr>
+        <w:pStyle w:val="FootnoteText"/>
+        <w:rPr>
+          <w:lang w:bidi="fa-IR"/>
+        </w:rPr>
+      </w:pPr>
+      <w:r>
+        <w:rPr>
+          <w:rStyle w:val="FootnoteReference"/>
+        </w:rPr>
+        <w:footnoteRef/>
+      </w:r>
+      <w:r>
+        <w:rPr>
+          <w:rtl/>
+        </w:rPr>
+        <w:t xml:space="preserve"> </w:t>
+      </w:r>
+      <w:r>
+        <w:rPr>
+          <w:lang w:bidi="fa-IR"/>
+        </w:rPr>
+        <w:t>Title&amp;Abstract</w:t>
+      </w:r>
+    </w:p>
+  </w:footnote>
+  <w:footnote w:id="98">
+    <w:p>
+      <w:pPr>
+        <w:pStyle w:val="FootnoteText"/>
+        <w:rPr>
+          <w:lang w:bidi="fa-IR"/>
+        </w:rPr>
+      </w:pPr>
+      <w:r>
+        <w:rPr>
+          <w:rStyle w:val="FootnoteReference"/>
+        </w:rPr>
+        <w:footnoteRef/>
+      </w:r>
+      <w:r>
+        <w:rPr>
+          <w:rtl/>
+        </w:rPr>
+        <w:t xml:space="preserve"> </w:t>
+      </w:r>
+      <w:r>
+        <w:rPr>
+          <w:lang w:bidi="fa-IR"/>
+        </w:rPr>
+        <w:t>Null</w:t>
+      </w:r>
+    </w:p>
+  </w:footnote>
+  <w:footnote w:id="99">
+    <w:p>
+      <w:pPr>
+        <w:pStyle w:val="FootnoteText"/>
+        <w:rPr>
+          <w:rtl/>
+          <w:lang w:bidi="fa-IR"/>
+        </w:rPr>
+      </w:pPr>
+      <w:r>
+        <w:rPr>
+          <w:rStyle w:val="FootnoteReference"/>
+        </w:rPr>
+        <w:footnoteRef/>
+      </w:r>
+      <w:r>
+        <w:rPr>
+          <w:rtl/>
+        </w:rPr>
+        <w:t xml:space="preserve"> </w:t>
+      </w:r>
+      <w:r>
+        <w:rPr>
+          <w:lang w:bidi="fa-IR"/>
+        </w:rPr>
+        <w:t>source</w:t>
+      </w:r>
+    </w:p>
+  </w:footnote>
+  <w:footnote w:id="100">
+    <w:p>
+      <w:pPr>
+        <w:pStyle w:val="FootnoteText"/>
+        <w:rPr>
+          <w:lang w:bidi="fa-IR"/>
+        </w:rPr>
+      </w:pPr>
+      <w:r>
+        <w:rPr>
+          <w:rStyle w:val="FootnoteReference"/>
+        </w:rPr>
+        <w:footnoteRef/>
+      </w:r>
+      <w:r>
+        <w:rPr>
+          <w:rtl/>
+        </w:rPr>
+        <w:t xml:space="preserve"> </w:t>
+      </w:r>
+      <w:r>
+        <w:rPr>
+          <w:lang w:bidi="fa-IR"/>
+        </w:rPr>
+        <w:t>target</w:t>
+      </w:r>
+    </w:p>
+  </w:footnote>
+  <w:footnote w:id="101">
     <w:p>
       <w:pPr>
         <w:pStyle w:val="FootnoteText"/>
@@ -70398,6 +71388,72 @@
         <w:lang w:bidi="fa-IR"/>
       </w:rPr>
       <w:instrText xml:space="preserve"> </w:instrText>
+    </w:r>
+    <w:r>
+      <w:rPr>
+        <w:rtl/>
+        <w:lang w:bidi="fa-IR"/>
+      </w:rPr>
+      <w:fldChar w:fldCharType="separate"/>
+    </w:r>
+    <w:r>
+      <w:rPr>
+        <w:noProof/>
+        <w:rtl/>
+        <w:lang w:bidi="fa-IR"/>
+      </w:rPr>
+      <w:t>فصل دوم : مبان</w:t>
+    </w:r>
+    <w:r>
+      <w:rPr>
+        <w:rFonts w:hint="cs"/>
+        <w:noProof/>
+        <w:rtl/>
+        <w:lang w:bidi="fa-IR"/>
+      </w:rPr>
+      <w:t>ی</w:t>
+    </w:r>
+    <w:r>
+      <w:rPr>
+        <w:noProof/>
+        <w:rtl/>
+        <w:lang w:bidi="fa-IR"/>
+      </w:rPr>
+      <w:t xml:space="preserve"> نظر</w:t>
+    </w:r>
+    <w:r>
+      <w:rPr>
+        <w:rFonts w:hint="cs"/>
+        <w:noProof/>
+        <w:rtl/>
+        <w:lang w:bidi="fa-IR"/>
+      </w:rPr>
+      <w:t>ی</w:t>
+    </w:r>
+    <w:r>
+      <w:rPr>
+        <w:noProof/>
+        <w:rtl/>
+        <w:lang w:bidi="fa-IR"/>
+      </w:rPr>
+      <w:t xml:space="preserve"> و پ</w:t>
+    </w:r>
+    <w:r>
+      <w:rPr>
+        <w:rFonts w:hint="cs"/>
+        <w:noProof/>
+        <w:rtl/>
+        <w:lang w:bidi="fa-IR"/>
+      </w:rPr>
+      <w:t>یشینه</w:t>
+    </w:r>
+    <w:r>
+      <w:rPr>
+        <w:noProof/>
+        <w:rtl/>
+        <w:lang w:bidi="fa-IR"/>
+      </w:rPr>
+      <w:t xml:space="preserve"> پژوهش</w:t>
     </w:r>
     <w:r>
       <w:rPr>
@@ -70841,7 +71897,7 @@
   <w:abstractNum w:abstractNumId="4" w15:restartNumberingAfterBreak="0">
     <w:nsid w:val="3BB25CEE"/>
     <w:multiLevelType w:val="hybridMultilevel"/>
-    <w:tmpl w:val="DD021F14"/>
+    <w:tmpl w:val="92960EA4"/>
     <w:lvl w:ilvl="0" w:tplc="04090001">
       <w:start w:val="1"/>
       <w:numFmt w:val="bullet"/>
@@ -72157,7 +73213,6 @@
   <w:style w:type="character" w:default="1" w:styleId="DefaultParagraphFont">
     <w:name w:val="Default Paragraph Font"/>
     <w:uiPriority w:val="1"/>
-    <w:semiHidden/>
     <w:unhideWhenUsed/>
   </w:style>
   <w:style w:type="table" w:default="1" w:styleId="TableNormal">

</xml_diff>